<commit_message>
Adicionado criterios de aceite
</commit_message>
<xml_diff>
--- a/Backlog inicial do projeto.docx
+++ b/Backlog inicial do projeto.docx
@@ -127,7 +127,7 @@
         <w:t>Cadastrar perfil</w:t>
       </w:r>
     </w:p>
-    <w:p>
+    <w:p w14:noSpellErr="1">
       <w:pPr>
         <w:pStyle w:val="PargrafodaLista"/>
         <w:rPr>
@@ -208,7 +208,7 @@
         </w:rPr>
       </w:pPr>
     </w:p>
-    <w:p>
+    <w:p w14:noSpellErr="1">
       <w:pPr>
         <w:pStyle w:val="PargrafodaLista"/>
         <w:rPr>
@@ -243,7 +243,7 @@
         <w:t>.</w:t>
       </w:r>
     </w:p>
-    <w:p>
+    <w:p w14:noSpellErr="1">
       <w:pPr>
         <w:pStyle w:val="PargrafodaLista"/>
         <w:rPr>
@@ -366,7 +366,7 @@
         <w:t>.</w:t>
       </w:r>
     </w:p>
-    <w:p>
+    <w:p w14:noSpellErr="1">
       <w:pPr>
         <w:pStyle w:val="PargrafodaLista"/>
         <w:rPr>
@@ -412,7 +412,7 @@
         <w:t>.</w:t>
       </w:r>
     </w:p>
-    <w:p>
+    <w:p w14:noSpellErr="1">
       <w:pPr>
         <w:pStyle w:val="PargrafodaLista"/>
         <w:rPr>
@@ -469,7 +469,7 @@
         <w:t>.</w:t>
       </w:r>
     </w:p>
-    <w:p>
+    <w:p w14:noSpellErr="1">
       <w:pPr>
         <w:pStyle w:val="PargrafodaLista"/>
         <w:rPr>
@@ -504,7 +504,7 @@
         <w:t>.</w:t>
       </w:r>
     </w:p>
-    <w:p>
+    <w:p w14:noSpellErr="1">
       <w:pPr>
         <w:pStyle w:val="PargrafodaLista"/>
         <w:rPr>
@@ -571,7 +571,7 @@
         <w:t>refeição</w:t>
       </w:r>
     </w:p>
-    <w:p>
+    <w:p w14:noSpellErr="1">
       <w:pPr>
         <w:pStyle w:val="PargrafodaLista"/>
         <w:rPr>
@@ -608,7 +608,7 @@
         </w:rPr>
       </w:pPr>
     </w:p>
-    <w:p>
+    <w:p w14:noSpellErr="1">
       <w:pPr>
         <w:pStyle w:val="PargrafodaLista"/>
         <w:rPr>
@@ -643,7 +643,7 @@
         <w:t>.</w:t>
       </w:r>
     </w:p>
-    <w:p>
+    <w:p w14:noSpellErr="1">
       <w:pPr>
         <w:pStyle w:val="PargrafodaLista"/>
         <w:rPr>
@@ -700,7 +700,7 @@
         <w:t>para o cadastro da refeição.</w:t>
       </w:r>
     </w:p>
-    <w:p>
+    <w:p w14:noSpellErr="1">
       <w:pPr>
         <w:pStyle w:val="PargrafodaLista"/>
         <w:rPr>
@@ -746,7 +746,7 @@
         <w:t>.</w:t>
       </w:r>
     </w:p>
-    <w:p>
+    <w:p w14:noSpellErr="1">
       <w:pPr>
         <w:pStyle w:val="PargrafodaLista"/>
         <w:rPr>
@@ -825,7 +825,7 @@
         <w:t>.</w:t>
       </w:r>
     </w:p>
-    <w:p>
+    <w:p w14:noSpellErr="1">
       <w:pPr>
         <w:pStyle w:val="PargrafodaLista"/>
         <w:rPr>
@@ -860,7 +860,7 @@
         <w:t>.</w:t>
       </w:r>
     </w:p>
-    <w:p>
+    <w:p w14:noSpellErr="1">
       <w:pPr>
         <w:pStyle w:val="PargrafodaLista"/>
         <w:rPr>
@@ -954,7 +954,7 @@
         <w:t>ões</w:t>
       </w:r>
     </w:p>
-    <w:p>
+    <w:p w14:noSpellErr="1">
       <w:pPr>
         <w:pStyle w:val="PargrafodaLista"/>
         <w:rPr>
@@ -1013,7 +1013,7 @@
         </w:rPr>
       </w:pPr>
     </w:p>
-    <w:p>
+    <w:p w14:noSpellErr="1">
       <w:pPr>
         <w:pStyle w:val="PargrafodaLista"/>
         <w:rPr>
@@ -1048,7 +1048,7 @@
         <w:t>.</w:t>
       </w:r>
     </w:p>
-    <w:p>
+    <w:p w14:noSpellErr="1">
       <w:pPr>
         <w:pStyle w:val="PargrafodaLista"/>
         <w:rPr>
@@ -1083,7 +1083,7 @@
         <w:t>como vai ser implementado a marcação das refeições.</w:t>
       </w:r>
     </w:p>
-    <w:p>
+    <w:p w14:noSpellErr="1">
       <w:pPr>
         <w:pStyle w:val="PargrafodaLista"/>
         <w:rPr>
@@ -1129,7 +1129,7 @@
         <w:t>.</w:t>
       </w:r>
     </w:p>
-    <w:p>
+    <w:p w14:noSpellErr="1">
       <w:pPr>
         <w:pStyle w:val="PargrafodaLista"/>
         <w:rPr>
@@ -1219,7 +1219,7 @@
         <w:t xml:space="preserve"> é fácil de estimar o tempo e esforço necessário para desenvolver.</w:t>
       </w:r>
     </w:p>
-    <w:p>
+    <w:p w14:noSpellErr="1">
       <w:pPr>
         <w:pStyle w:val="PargrafodaLista"/>
         <w:rPr>
@@ -1254,7 +1254,7 @@
         <w:t>.</w:t>
       </w:r>
     </w:p>
-    <w:p>
+    <w:p w14:noSpellErr="1">
       <w:pPr>
         <w:pStyle w:val="PargrafodaLista"/>
         <w:rPr>
@@ -1324,7 +1324,7 @@
         <w:t>Editar refeição</w:t>
       </w:r>
     </w:p>
-    <w:p>
+    <w:p w14:noSpellErr="1">
       <w:pPr>
         <w:pStyle w:val="PargrafodaLista"/>
         <w:rPr>
@@ -1361,7 +1361,7 @@
         </w:rPr>
       </w:pPr>
     </w:p>
-    <w:p>
+    <w:p w14:noSpellErr="1">
       <w:pPr>
         <w:pStyle w:val="PargrafodaLista"/>
         <w:rPr>
@@ -1396,7 +1396,7 @@
         <w:t>.</w:t>
       </w:r>
     </w:p>
-    <w:p>
+    <w:p w14:noSpellErr="1">
       <w:pPr>
         <w:pStyle w:val="PargrafodaLista"/>
         <w:rPr>
@@ -1442,7 +1442,7 @@
         <w:t xml:space="preserve"> das refeições.</w:t>
       </w:r>
     </w:p>
-    <w:p>
+    <w:p w14:noSpellErr="1">
       <w:pPr>
         <w:pStyle w:val="PargrafodaLista"/>
         <w:rPr>
@@ -1488,7 +1488,7 @@
         <w:t>.</w:t>
       </w:r>
     </w:p>
-    <w:p>
+    <w:p w14:noSpellErr="1">
       <w:pPr>
         <w:pStyle w:val="PargrafodaLista"/>
         <w:rPr>
@@ -1603,10 +1603,20 @@
           <w:shd w:val="clear" w:color="auto" w:fill="FFFFFF"/>
         </w:rPr>
         <w:tab/>
+      </w:r>
+      <w:r>
+        <w:rPr>
+          <w:rFonts w:ascii="Arial" w:hAnsi="Arial" w:cs="Arial"/>
+          <w:color w:val="292A2E"/>
+          <w:spacing w:val="-1"/>
+          <w:sz w:val="24"/>
+          <w:szCs w:val="24"/>
+          <w:shd w:val="clear" w:color="auto" w:fill="FFFFFF"/>
+        </w:rPr>
         <w:t>.</w:t>
       </w:r>
     </w:p>
-    <w:p>
+    <w:p w14:noSpellErr="1">
       <w:pPr>
         <w:pStyle w:val="PargrafodaLista"/>
         <w:rPr>
@@ -1672,22 +1682,27 @@
           <w:ilvl w:val="0"/>
           <w:numId w:val="1"/>
         </w:numPr>
-        <w:rPr>
-          <w:rFonts w:ascii="Arial" w:hAnsi="Arial" w:cs="Arial"/>
-          <w:sz w:val="24"/>
-          <w:szCs w:val="24"/>
-        </w:rPr>
-      </w:pPr>
-      <w:r>
-        <w:rPr>
-          <w:rFonts w:ascii="Arial" w:hAnsi="Arial" w:cs="Arial"/>
-          <w:sz w:val="24"/>
-          <w:szCs w:val="24"/>
-        </w:rPr>
-        <w:t>Notificações de lembrete</w:t>
-      </w:r>
-    </w:p>
-    <w:p>
+        <w:suppressLineNumbers w:val="0"/>
+        <w:bidi w:val="0"/>
+        <w:spacing w:before="0" w:beforeAutospacing="off" w:after="160" w:afterAutospacing="off" w:line="259" w:lineRule="auto"/>
+        <w:ind w:left="720" w:right="0" w:hanging="360"/>
+        <w:jc w:val="left"/>
+        <w:rPr>
+          <w:rFonts w:ascii="Arial" w:hAnsi="Arial" w:cs="Arial"/>
+          <w:sz w:val="24"/>
+          <w:szCs w:val="24"/>
+        </w:rPr>
+      </w:pPr>
+      <w:r>
+        <w:rPr>
+          <w:rFonts w:ascii="Arial" w:hAnsi="Arial" w:cs="Arial"/>
+          <w:sz w:val="24"/>
+          <w:szCs w:val="24"/>
+        </w:rPr>
+        <w:t>N</w:t>
+      </w:r>
+    </w:p>
+    <w:p w14:noSpellErr="1">
       <w:pPr>
         <w:pStyle w:val="PargrafodaLista"/>
         <w:rPr>
@@ -1724,7 +1739,7 @@
         </w:rPr>
       </w:pPr>
     </w:p>
-    <w:p>
+    <w:p w14:noSpellErr="1">
       <w:pPr>
         <w:pStyle w:val="PargrafodaLista"/>
         <w:rPr>
@@ -1748,7 +1763,7 @@
         <w:t>I: A história não cria dependências com outras histórias.</w:t>
       </w:r>
     </w:p>
-    <w:p>
+    <w:p w14:noSpellErr="1">
       <w:pPr>
         <w:pStyle w:val="PargrafodaLista"/>
         <w:rPr>
@@ -1794,7 +1809,7 @@
         <w:t>.</w:t>
       </w:r>
     </w:p>
-    <w:p>
+    <w:p w14:noSpellErr="1">
       <w:pPr>
         <w:pStyle w:val="PargrafodaLista"/>
         <w:rPr>
@@ -1840,7 +1855,7 @@
         <w:t>.</w:t>
       </w:r>
     </w:p>
-    <w:p>
+    <w:p w14:noSpellErr="1">
       <w:pPr>
         <w:pStyle w:val="PargrafodaLista"/>
         <w:rPr>
@@ -1933,10 +1948,20 @@
           <w:shd w:val="clear" w:color="auto" w:fill="FFFFFF"/>
         </w:rPr>
         <w:tab/>
+      </w:r>
+      <w:r>
+        <w:rPr>
+          <w:rFonts w:ascii="Arial" w:hAnsi="Arial" w:cs="Arial"/>
+          <w:color w:val="292A2E"/>
+          <w:spacing w:val="-1"/>
+          <w:sz w:val="24"/>
+          <w:szCs w:val="24"/>
+          <w:shd w:val="clear" w:color="auto" w:fill="FFFFFF"/>
+        </w:rPr>
         <w:t>.</w:t>
       </w:r>
     </w:p>
-    <w:p>
+    <w:p w14:noSpellErr="1">
       <w:pPr>
         <w:pStyle w:val="PargrafodaLista"/>
         <w:rPr>
@@ -2028,7 +2053,7 @@
         </w:rPr>
       </w:pPr>
     </w:p>
-    <w:p>
+    <w:p w14:noSpellErr="1">
       <w:pPr>
         <w:pStyle w:val="PargrafodaLista"/>
         <w:numPr>
@@ -2080,7 +2105,7 @@
         <w:br/>
       </w:r>
     </w:p>
-    <w:p>
+    <w:p w14:noSpellErr="1">
       <w:pPr>
         <w:pStyle w:val="PargrafodaLista"/>
         <w:rPr>
@@ -2104,7 +2129,7 @@
         <w:t>I: A história não cria dependências com outras histórias.</w:t>
       </w:r>
     </w:p>
-    <w:p>
+    <w:p w14:noSpellErr="1">
       <w:pPr>
         <w:pStyle w:val="PargrafodaLista"/>
         <w:rPr>
@@ -2150,7 +2175,7 @@
         <w:t>.</w:t>
       </w:r>
     </w:p>
-    <w:p>
+    <w:p w14:noSpellErr="1">
       <w:pPr>
         <w:pStyle w:val="PargrafodaLista"/>
         <w:rPr>
@@ -2196,7 +2221,7 @@
         <w:t>.</w:t>
       </w:r>
     </w:p>
-    <w:p>
+    <w:p w14:noSpellErr="1">
       <w:pPr>
         <w:pStyle w:val="PargrafodaLista"/>
         <w:rPr>
@@ -2278,10 +2303,20 @@
           <w:shd w:val="clear" w:color="auto" w:fill="FFFFFF"/>
         </w:rPr>
         <w:tab/>
+      </w:r>
+      <w:r>
+        <w:rPr>
+          <w:rFonts w:ascii="Arial" w:hAnsi="Arial" w:cs="Arial"/>
+          <w:color w:val="292A2E"/>
+          <w:spacing w:val="-1"/>
+          <w:sz w:val="24"/>
+          <w:szCs w:val="24"/>
+          <w:shd w:val="clear" w:color="auto" w:fill="FFFFFF"/>
+        </w:rPr>
         <w:t>.</w:t>
       </w:r>
     </w:p>
-    <w:p>
+    <w:p w14:noSpellErr="1">
       <w:pPr>
         <w:pStyle w:val="PargrafodaLista"/>
         <w:rPr>
@@ -2340,7 +2375,7 @@
         </w:rPr>
       </w:pPr>
     </w:p>
-    <w:p>
+    <w:p w14:noSpellErr="1">
       <w:pPr>
         <w:pStyle w:val="PargrafodaLista"/>
         <w:numPr>
@@ -2392,7 +2427,6 @@
           <w:szCs w:val="21"/>
           <w:shd w:val="clear" w:color="auto" w:fill="FFFFFF"/>
         </w:rPr>
-        <w:lastRenderedPageBreak/>
         <w:t>acompanhamento do meu progresso.</w:t>
       </w:r>
       <w:r>
@@ -2407,7 +2441,7 @@
         <w:br/>
       </w:r>
     </w:p>
-    <w:p>
+    <w:p w14:noSpellErr="1">
       <w:pPr>
         <w:pStyle w:val="PargrafodaLista"/>
         <w:rPr>
@@ -2431,7 +2465,7 @@
         <w:t>I: A história não cria dependências com outras histórias.</w:t>
       </w:r>
     </w:p>
-    <w:p>
+    <w:p w14:noSpellErr="1">
       <w:pPr>
         <w:pStyle w:val="PargrafodaLista"/>
         <w:rPr>
@@ -2477,7 +2511,7 @@
         <w:t xml:space="preserve"> e como será implementado.</w:t>
       </w:r>
     </w:p>
-    <w:p>
+    <w:p w14:noSpellErr="1">
       <w:pPr>
         <w:pStyle w:val="PargrafodaLista"/>
         <w:rPr>
@@ -2523,7 +2557,7 @@
         <w:t>.</w:t>
       </w:r>
     </w:p>
-    <w:p>
+    <w:p w14:noSpellErr="1">
       <w:pPr>
         <w:pStyle w:val="PargrafodaLista"/>
         <w:rPr>
@@ -2605,10 +2639,20 @@
           <w:shd w:val="clear" w:color="auto" w:fill="FFFFFF"/>
         </w:rPr>
         <w:tab/>
+      </w:r>
+      <w:r>
+        <w:rPr>
+          <w:rFonts w:ascii="Arial" w:hAnsi="Arial" w:cs="Arial"/>
+          <w:color w:val="292A2E"/>
+          <w:spacing w:val="-1"/>
+          <w:sz w:val="24"/>
+          <w:szCs w:val="24"/>
+          <w:shd w:val="clear" w:color="auto" w:fill="FFFFFF"/>
+        </w:rPr>
         <w:t>.</w:t>
       </w:r>
     </w:p>
-    <w:p>
+    <w:p w14:noSpellErr="1">
       <w:pPr>
         <w:pStyle w:val="PargrafodaLista"/>
         <w:rPr>
@@ -2980,8 +3024,1526 @@
         </w:rPr>
       </w:pPr>
     </w:p>
+    <w:p>
+      <w:pPr>
+        <w:pStyle w:val="PargrafodaLista"/>
+        <w:rPr>
+          <w:rFonts w:ascii="Arial" w:hAnsi="Arial" w:cs="Arial"/>
+          <w:sz w:val="24"/>
+          <w:szCs w:val="24"/>
+        </w:rPr>
+      </w:pPr>
+    </w:p>
+    <w:p>
+      <w:pPr>
+        <w:pStyle w:val="PargrafodaLista"/>
+        <w:rPr>
+          <w:rFonts w:ascii="Arial" w:hAnsi="Arial" w:cs="Arial"/>
+          <w:sz w:val="24"/>
+          <w:szCs w:val="24"/>
+        </w:rPr>
+      </w:pPr>
+    </w:p>
+    <w:p>
+      <w:pPr>
+        <w:pStyle w:val="PargrafodaLista"/>
+        <w:rPr>
+          <w:rFonts w:ascii="Arial" w:hAnsi="Arial" w:cs="Arial"/>
+          <w:sz w:val="24"/>
+          <w:szCs w:val="24"/>
+        </w:rPr>
+      </w:pPr>
+    </w:p>
+    <w:p>
+      <w:pPr>
+        <w:pStyle w:val="PargrafodaLista"/>
+        <w:rPr>
+          <w:rFonts w:ascii="Arial" w:hAnsi="Arial" w:cs="Arial"/>
+          <w:sz w:val="24"/>
+          <w:szCs w:val="24"/>
+        </w:rPr>
+      </w:pPr>
+    </w:p>
+    <w:p>
+      <w:pPr>
+        <w:pStyle w:val="PargrafodaLista"/>
+        <w:rPr>
+          <w:rFonts w:ascii="Arial" w:hAnsi="Arial" w:cs="Arial"/>
+          <w:sz w:val="24"/>
+          <w:szCs w:val="24"/>
+        </w:rPr>
+      </w:pPr>
+    </w:p>
+    <w:p>
+      <w:pPr>
+        <w:pStyle w:val="Normal"/>
+        <w:ind w:left="0"/>
+        <w:rPr>
+          <w:rFonts w:ascii="Arial" w:hAnsi="Arial" w:cs="Arial"/>
+          <w:sz w:val="24"/>
+          <w:szCs w:val="24"/>
+          <w:u w:val="single"/>
+        </w:rPr>
+      </w:pPr>
+      <w:r>
+        <w:rPr>
+          <w:rFonts w:ascii="Arial" w:hAnsi="Arial" w:cs="Arial"/>
+          <w:sz w:val="24"/>
+          <w:szCs w:val="24"/>
+          <w:u w:val="single"/>
+        </w:rPr>
+        <w:t>Critérios de aceite</w:t>
+      </w:r>
+    </w:p>
+    <w:p>
+      <w:pPr>
+        <w:pStyle w:val="Normal"/>
+        <w:ind w:left="0"/>
+        <w:rPr>
+          <w:rFonts w:ascii="Arial" w:hAnsi="Arial" w:cs="Arial"/>
+          <w:sz w:val="24"/>
+          <w:szCs w:val="24"/>
+          <w:u w:val="none"/>
+        </w:rPr>
+      </w:pPr>
+      <w:r>
+        <w:rPr>
+          <w:rFonts w:ascii="Arial" w:hAnsi="Arial" w:cs="Arial"/>
+          <w:sz w:val="24"/>
+          <w:szCs w:val="24"/>
+          <w:u w:val="none"/>
+        </w:rPr>
+        <w:t>1. Cadastrar perfil</w:t>
+      </w:r>
+      <w:r>
+        <w:rPr>
+          <w:rFonts w:ascii="Arial" w:hAnsi="Arial" w:cs="Arial"/>
+          <w:sz w:val="24"/>
+          <w:szCs w:val="24"/>
+          <w:u w:val="none"/>
+        </w:rPr>
+        <w:t>:</w:t>
+      </w:r>
+    </w:p>
+    <w:p>
+      <w:pPr>
+        <w:pStyle w:val="PargrafodaLista"/>
+        <w:ind w:firstLine="708"/>
+        <w:rPr>
+          <w:rFonts w:ascii="Arial" w:hAnsi="Arial" w:cs="Arial"/>
+          <w:sz w:val="24"/>
+          <w:szCs w:val="24"/>
+        </w:rPr>
+      </w:pPr>
+      <w:r>
+        <w:rPr>
+          <w:rFonts w:ascii="Arial" w:hAnsi="Arial" w:cs="Arial"/>
+          <w:sz w:val="24"/>
+          <w:szCs w:val="24"/>
+        </w:rPr>
+        <w:t xml:space="preserve">a)  </w:t>
+      </w:r>
+    </w:p>
+    <w:p>
+      <w:pPr>
+        <w:pStyle w:val="PargrafodaLista"/>
+        <w:numPr>
+          <w:ilvl w:val="0"/>
+          <w:numId w:val="3"/>
+        </w:numPr>
+        <w:rPr>
+          <w:rFonts w:ascii="Arial" w:hAnsi="Arial" w:cs="Arial"/>
+          <w:sz w:val="24"/>
+          <w:szCs w:val="24"/>
+        </w:rPr>
+      </w:pPr>
+      <w:r>
+        <w:rPr>
+          <w:rFonts w:ascii="Arial" w:hAnsi="Arial" w:cs="Arial"/>
+          <w:sz w:val="24"/>
+          <w:szCs w:val="24"/>
+        </w:rPr>
+        <w:t xml:space="preserve">Dado que seja a primeira vez do usuário usando o aplicativo, quando abrir o aplicativo, então </w:t>
+      </w:r>
+      <w:r>
+        <w:rPr>
+          <w:rFonts w:ascii="Arial" w:hAnsi="Arial" w:cs="Arial"/>
+          <w:sz w:val="24"/>
+          <w:szCs w:val="24"/>
+        </w:rPr>
+        <w:t>o sistema abrirá a tela de cadastro.</w:t>
+      </w:r>
+    </w:p>
+    <w:p>
+      <w:pPr>
+        <w:pStyle w:val="PargrafodaLista"/>
+        <w:numPr>
+          <w:ilvl w:val="0"/>
+          <w:numId w:val="3"/>
+        </w:numPr>
+        <w:rPr>
+          <w:rFonts w:ascii="Arial" w:hAnsi="Arial" w:cs="Arial"/>
+          <w:sz w:val="24"/>
+          <w:szCs w:val="24"/>
+        </w:rPr>
+      </w:pPr>
+      <w:r>
+        <w:rPr>
+          <w:rFonts w:ascii="Arial" w:hAnsi="Arial" w:cs="Arial"/>
+          <w:sz w:val="24"/>
+          <w:szCs w:val="24"/>
+        </w:rPr>
+        <w:t>Dado que o usuário esteja na tela de cadastro, quando preencher os dados corretamente e clicar em “Cadastrar”</w:t>
+      </w:r>
+      <w:r>
+        <w:rPr>
+          <w:rFonts w:ascii="Arial" w:hAnsi="Arial" w:cs="Arial"/>
+          <w:sz w:val="24"/>
+          <w:szCs w:val="24"/>
+        </w:rPr>
+        <w:t>, então</w:t>
+      </w:r>
+      <w:r>
+        <w:rPr>
+          <w:rFonts w:ascii="Arial" w:hAnsi="Arial" w:cs="Arial"/>
+          <w:sz w:val="24"/>
+          <w:szCs w:val="24"/>
+        </w:rPr>
+        <w:t xml:space="preserve"> </w:t>
+      </w:r>
+      <w:r>
+        <w:rPr>
+          <w:rFonts w:ascii="Arial" w:hAnsi="Arial" w:cs="Arial"/>
+          <w:sz w:val="24"/>
+          <w:szCs w:val="24"/>
+        </w:rPr>
+        <w:t xml:space="preserve">o </w:t>
+      </w:r>
+      <w:r>
+        <w:rPr>
+          <w:rFonts w:ascii="Arial" w:hAnsi="Arial" w:cs="Arial"/>
+          <w:sz w:val="24"/>
+          <w:szCs w:val="24"/>
+        </w:rPr>
+        <w:t>sistema irá redirecioná-lo para a tela inicial.</w:t>
+      </w:r>
+    </w:p>
+    <w:p>
+      <w:pPr>
+        <w:pStyle w:val="PargrafodaLista"/>
+        <w:ind w:firstLine="708"/>
+        <w:rPr>
+          <w:rFonts w:ascii="Arial" w:hAnsi="Arial" w:cs="Arial"/>
+          <w:sz w:val="24"/>
+          <w:szCs w:val="24"/>
+        </w:rPr>
+      </w:pPr>
+      <w:r>
+        <w:rPr>
+          <w:rFonts w:ascii="Arial" w:hAnsi="Arial" w:cs="Arial"/>
+          <w:sz w:val="24"/>
+          <w:szCs w:val="24"/>
+        </w:rPr>
+        <w:t xml:space="preserve">b) Dado que o usuário preencheu corretamente os campos do cadastro, quando clicar em “Cadastrar”, então </w:t>
+      </w:r>
+      <w:r>
+        <w:rPr>
+          <w:rFonts w:ascii="Arial" w:hAnsi="Arial" w:cs="Arial"/>
+          <w:sz w:val="24"/>
+          <w:szCs w:val="24"/>
+        </w:rPr>
+        <w:t>os dados serão criptografados antes de serem salvos no banco de dados</w:t>
+      </w:r>
+      <w:r>
+        <w:rPr>
+          <w:rFonts w:ascii="Arial" w:hAnsi="Arial" w:cs="Arial"/>
+          <w:sz w:val="24"/>
+          <w:szCs w:val="24"/>
+        </w:rPr>
+        <w:t xml:space="preserve"> respeitando a LGPD</w:t>
+      </w:r>
+      <w:r>
+        <w:rPr>
+          <w:rFonts w:ascii="Arial" w:hAnsi="Arial" w:cs="Arial"/>
+          <w:sz w:val="24"/>
+          <w:szCs w:val="24"/>
+        </w:rPr>
+        <w:t>.</w:t>
+      </w:r>
+    </w:p>
+    <w:p>
+      <w:pPr>
+        <w:pStyle w:val="PargrafodaLista"/>
+        <w:ind w:firstLine="708"/>
+        <w:rPr>
+          <w:rFonts w:ascii="Arial" w:hAnsi="Arial" w:cs="Arial"/>
+          <w:sz w:val="24"/>
+          <w:szCs w:val="24"/>
+        </w:rPr>
+      </w:pPr>
+    </w:p>
+    <w:p>
+      <w:pPr>
+        <w:pStyle w:val="PargrafodaLista"/>
+        <w:ind w:firstLine="0"/>
+        <w:rPr>
+          <w:rFonts w:ascii="Arial" w:hAnsi="Arial" w:cs="Arial"/>
+          <w:sz w:val="24"/>
+          <w:szCs w:val="24"/>
+        </w:rPr>
+      </w:pPr>
+      <w:r>
+        <w:rPr>
+          <w:rFonts w:ascii="Arial" w:hAnsi="Arial" w:cs="Arial"/>
+          <w:sz w:val="24"/>
+          <w:szCs w:val="24"/>
+        </w:rPr>
+        <w:t>2. Cadastrar refeição:</w:t>
+      </w:r>
+    </w:p>
+    <w:p>
+      <w:pPr>
+        <w:pStyle w:val="PargrafodaLista"/>
+        <w:ind w:firstLine="0"/>
+        <w:rPr>
+          <w:rFonts w:ascii="Arial" w:hAnsi="Arial" w:cs="Arial"/>
+          <w:sz w:val="24"/>
+          <w:szCs w:val="24"/>
+        </w:rPr>
+      </w:pPr>
+    </w:p>
+    <w:p>
+      <w:pPr>
+        <w:pStyle w:val="PargrafodaLista"/>
+        <w:ind w:firstLine="708"/>
+        <w:rPr>
+          <w:rFonts w:ascii="Arial" w:hAnsi="Arial" w:cs="Arial"/>
+          <w:sz w:val="24"/>
+          <w:szCs w:val="24"/>
+        </w:rPr>
+      </w:pPr>
+      <w:r>
+        <w:rPr>
+          <w:rFonts w:ascii="Arial" w:hAnsi="Arial" w:cs="Arial"/>
+          <w:sz w:val="24"/>
+          <w:szCs w:val="24"/>
+        </w:rPr>
+        <w:t xml:space="preserve">a)  </w:t>
+      </w:r>
+    </w:p>
+    <w:p>
+      <w:pPr>
+        <w:pStyle w:val="PargrafodaLista"/>
+        <w:numPr>
+          <w:ilvl w:val="0"/>
+          <w:numId w:val="3"/>
+        </w:numPr>
+        <w:suppressLineNumbers w:val="0"/>
+        <w:bidi w:val="0"/>
+        <w:spacing w:before="0" w:beforeAutospacing="off" w:after="160" w:afterAutospacing="off" w:line="259" w:lineRule="auto"/>
+        <w:ind w:left="1788" w:right="0" w:hanging="360"/>
+        <w:jc w:val="left"/>
+        <w:rPr>
+          <w:rFonts w:ascii="Arial" w:hAnsi="Arial" w:cs="Arial"/>
+          <w:sz w:val="24"/>
+          <w:szCs w:val="24"/>
+        </w:rPr>
+      </w:pPr>
+      <w:r>
+        <w:rPr>
+          <w:rFonts w:ascii="Arial" w:hAnsi="Arial" w:cs="Arial"/>
+          <w:sz w:val="24"/>
+          <w:szCs w:val="24"/>
+        </w:rPr>
+        <w:t>Dado que o usuário</w:t>
+      </w:r>
+      <w:r>
+        <w:rPr>
+          <w:rFonts w:ascii="Arial" w:hAnsi="Arial" w:cs="Arial"/>
+          <w:sz w:val="24"/>
+          <w:szCs w:val="24"/>
+        </w:rPr>
+        <w:t xml:space="preserve"> tenha preenchido corretamente os dados da refeição</w:t>
+      </w:r>
+      <w:r>
+        <w:rPr>
+          <w:rFonts w:ascii="Arial" w:hAnsi="Arial" w:cs="Arial"/>
+          <w:sz w:val="24"/>
+          <w:szCs w:val="24"/>
+        </w:rPr>
+        <w:t xml:space="preserve">, quando </w:t>
+      </w:r>
+      <w:r>
+        <w:rPr>
+          <w:rFonts w:ascii="Arial" w:hAnsi="Arial" w:cs="Arial"/>
+          <w:sz w:val="24"/>
+          <w:szCs w:val="24"/>
+        </w:rPr>
+        <w:t>clicar em “Cadastrar refeição”, então será redirecionado para a tela de refeições e poderá visualizar a nova refeição na lista.</w:t>
+      </w:r>
+    </w:p>
+    <w:p>
+      <w:pPr>
+        <w:pStyle w:val="PargrafodaLista"/>
+        <w:numPr>
+          <w:ilvl w:val="0"/>
+          <w:numId w:val="3"/>
+        </w:numPr>
+        <w:suppressLineNumbers w:val="0"/>
+        <w:bidi w:val="0"/>
+        <w:spacing w:before="0" w:beforeAutospacing="off" w:after="160" w:afterAutospacing="off" w:line="259" w:lineRule="auto"/>
+        <w:ind w:left="1788" w:right="0" w:hanging="360"/>
+        <w:jc w:val="left"/>
+        <w:rPr>
+          <w:rFonts w:ascii="Arial" w:hAnsi="Arial" w:cs="Arial"/>
+          <w:sz w:val="24"/>
+          <w:szCs w:val="24"/>
+        </w:rPr>
+      </w:pPr>
+      <w:r>
+        <w:rPr>
+          <w:rFonts w:ascii="Arial" w:hAnsi="Arial" w:cs="Arial"/>
+          <w:sz w:val="24"/>
+          <w:szCs w:val="24"/>
+        </w:rPr>
+        <w:t xml:space="preserve">Dado que o usuário tenha adicionado uma nova refeição, ao abrir </w:t>
+      </w:r>
+      <w:r>
+        <w:rPr>
+          <w:rFonts w:ascii="Arial" w:hAnsi="Arial" w:cs="Arial"/>
+          <w:sz w:val="24"/>
+          <w:szCs w:val="24"/>
+        </w:rPr>
+        <w:t>a</w:t>
+      </w:r>
+      <w:r>
+        <w:rPr>
+          <w:rFonts w:ascii="Arial" w:hAnsi="Arial" w:cs="Arial"/>
+          <w:sz w:val="24"/>
+          <w:szCs w:val="24"/>
+        </w:rPr>
+        <w:t xml:space="preserve"> dashboard, então verá os </w:t>
+      </w:r>
+      <w:r>
+        <w:rPr>
+          <w:rFonts w:ascii="Arial" w:hAnsi="Arial" w:cs="Arial"/>
+          <w:sz w:val="24"/>
+          <w:szCs w:val="24"/>
+        </w:rPr>
+        <w:t>gráficos</w:t>
+      </w:r>
+      <w:r>
+        <w:rPr>
+          <w:rFonts w:ascii="Arial" w:hAnsi="Arial" w:cs="Arial"/>
+          <w:sz w:val="24"/>
+          <w:szCs w:val="24"/>
+        </w:rPr>
+        <w:t xml:space="preserve"> de macronutrientes</w:t>
+      </w:r>
+      <w:r>
+        <w:rPr>
+          <w:rFonts w:ascii="Arial" w:hAnsi="Arial" w:cs="Arial"/>
+          <w:sz w:val="24"/>
+          <w:szCs w:val="24"/>
+        </w:rPr>
+        <w:t xml:space="preserve"> atualizados com os dados da</w:t>
+      </w:r>
+      <w:r>
+        <w:rPr>
+          <w:rFonts w:ascii="Arial" w:hAnsi="Arial" w:cs="Arial"/>
+          <w:sz w:val="24"/>
+          <w:szCs w:val="24"/>
+        </w:rPr>
+        <w:t xml:space="preserve"> </w:t>
+      </w:r>
+      <w:r>
+        <w:rPr>
+          <w:rFonts w:ascii="Arial" w:hAnsi="Arial" w:cs="Arial"/>
+          <w:sz w:val="24"/>
+          <w:szCs w:val="24"/>
+        </w:rPr>
+        <w:t>nova refeição.</w:t>
+      </w:r>
+    </w:p>
+    <w:p>
+      <w:pPr>
+        <w:pStyle w:val="PargrafodaLista"/>
+        <w:ind w:firstLine="708"/>
+        <w:rPr>
+          <w:rFonts w:ascii="Arial" w:hAnsi="Arial" w:cs="Arial"/>
+          <w:sz w:val="24"/>
+          <w:szCs w:val="24"/>
+        </w:rPr>
+      </w:pPr>
+      <w:r>
+        <w:rPr>
+          <w:rFonts w:ascii="Arial" w:hAnsi="Arial" w:cs="Arial"/>
+          <w:sz w:val="24"/>
+          <w:szCs w:val="24"/>
+        </w:rPr>
+        <w:t xml:space="preserve">b) Dado que o usuário </w:t>
+      </w:r>
+      <w:r>
+        <w:rPr>
+          <w:rFonts w:ascii="Arial" w:hAnsi="Arial" w:cs="Arial"/>
+          <w:sz w:val="24"/>
+          <w:szCs w:val="24"/>
+        </w:rPr>
+        <w:t>não esteja conectado à internet e tenha cadastrado uma refeição, quando se conectar novamente a internet, então os dados da nova refeição serão enviados para a nuvem.</w:t>
+      </w:r>
+    </w:p>
+    <w:p>
+      <w:pPr>
+        <w:pStyle w:val="PargrafodaLista"/>
+        <w:ind w:firstLine="708"/>
+        <w:rPr>
+          <w:rFonts w:ascii="Arial" w:hAnsi="Arial" w:cs="Arial"/>
+          <w:sz w:val="24"/>
+          <w:szCs w:val="24"/>
+        </w:rPr>
+      </w:pPr>
+    </w:p>
+    <w:p>
+      <w:pPr>
+        <w:pStyle w:val="PargrafodaLista"/>
+        <w:ind w:firstLine="0"/>
+        <w:rPr>
+          <w:rFonts w:ascii="Arial" w:hAnsi="Arial" w:cs="Arial"/>
+          <w:sz w:val="24"/>
+          <w:szCs w:val="24"/>
+        </w:rPr>
+      </w:pPr>
+      <w:r>
+        <w:rPr>
+          <w:rFonts w:ascii="Arial" w:hAnsi="Arial" w:cs="Arial"/>
+          <w:sz w:val="24"/>
+          <w:szCs w:val="24"/>
+        </w:rPr>
+        <w:t>3. Checklist das refeições:</w:t>
+      </w:r>
+    </w:p>
+    <w:p>
+      <w:pPr>
+        <w:pStyle w:val="PargrafodaLista"/>
+        <w:ind w:firstLine="0"/>
+        <w:rPr>
+          <w:rFonts w:ascii="Arial" w:hAnsi="Arial" w:cs="Arial"/>
+          <w:sz w:val="24"/>
+          <w:szCs w:val="24"/>
+        </w:rPr>
+      </w:pPr>
+    </w:p>
+    <w:p>
+      <w:pPr>
+        <w:pStyle w:val="PargrafodaLista"/>
+        <w:ind w:firstLine="708"/>
+        <w:rPr>
+          <w:rFonts w:ascii="Arial" w:hAnsi="Arial" w:cs="Arial"/>
+          <w:sz w:val="24"/>
+          <w:szCs w:val="24"/>
+        </w:rPr>
+      </w:pPr>
+      <w:r>
+        <w:rPr>
+          <w:rFonts w:ascii="Arial" w:hAnsi="Arial" w:cs="Arial"/>
+          <w:sz w:val="24"/>
+          <w:szCs w:val="24"/>
+        </w:rPr>
+        <w:t xml:space="preserve">a)  </w:t>
+      </w:r>
+    </w:p>
+    <w:p>
+      <w:pPr>
+        <w:pStyle w:val="PargrafodaLista"/>
+        <w:numPr>
+          <w:ilvl w:val="0"/>
+          <w:numId w:val="3"/>
+        </w:numPr>
+        <w:suppressLineNumbers w:val="0"/>
+        <w:bidi w:val="0"/>
+        <w:spacing w:before="0" w:beforeAutospacing="off" w:after="160" w:afterAutospacing="off" w:line="259" w:lineRule="auto"/>
+        <w:ind w:left="1788" w:right="0" w:hanging="360"/>
+        <w:jc w:val="left"/>
+        <w:rPr>
+          <w:rFonts w:ascii="Arial" w:hAnsi="Arial" w:cs="Arial"/>
+          <w:sz w:val="24"/>
+          <w:szCs w:val="24"/>
+        </w:rPr>
+      </w:pPr>
+      <w:r>
+        <w:rPr>
+          <w:rFonts w:ascii="Arial" w:hAnsi="Arial" w:cs="Arial"/>
+          <w:sz w:val="24"/>
+          <w:szCs w:val="24"/>
+        </w:rPr>
+        <w:t xml:space="preserve">Dado que o usuário tenha refeições cadastradas, quando clicar no </w:t>
+      </w:r>
+      <w:r>
+        <w:rPr>
+          <w:rFonts w:ascii="Arial" w:hAnsi="Arial" w:cs="Arial"/>
+          <w:i w:val="1"/>
+          <w:iCs w:val="1"/>
+          <w:sz w:val="24"/>
+          <w:szCs w:val="24"/>
+        </w:rPr>
+        <w:t>check</w:t>
+      </w:r>
+      <w:r>
+        <w:rPr>
+          <w:rFonts w:ascii="Arial" w:hAnsi="Arial" w:cs="Arial"/>
+          <w:sz w:val="24"/>
+          <w:szCs w:val="24"/>
+        </w:rPr>
+        <w:t xml:space="preserve"> da refeição, então o sistema irá riscar a refeição na lista.</w:t>
+      </w:r>
+    </w:p>
+    <w:p>
+      <w:pPr>
+        <w:pStyle w:val="PargrafodaLista"/>
+        <w:numPr>
+          <w:ilvl w:val="0"/>
+          <w:numId w:val="3"/>
+        </w:numPr>
+        <w:suppressLineNumbers w:val="0"/>
+        <w:bidi w:val="0"/>
+        <w:spacing w:before="0" w:beforeAutospacing="off" w:after="160" w:afterAutospacing="off" w:line="259" w:lineRule="auto"/>
+        <w:ind w:left="1788" w:right="0" w:hanging="360"/>
+        <w:jc w:val="left"/>
+        <w:rPr>
+          <w:rFonts w:ascii="Arial" w:hAnsi="Arial" w:cs="Arial"/>
+          <w:sz w:val="24"/>
+          <w:szCs w:val="24"/>
+        </w:rPr>
+      </w:pPr>
+      <w:r>
+        <w:rPr>
+          <w:rFonts w:ascii="Arial" w:hAnsi="Arial" w:cs="Arial"/>
+          <w:sz w:val="24"/>
+          <w:szCs w:val="24"/>
+        </w:rPr>
+        <w:t xml:space="preserve">Dado que o usuário tenha dado </w:t>
+      </w:r>
+      <w:r>
+        <w:rPr>
+          <w:rFonts w:ascii="Arial" w:hAnsi="Arial" w:cs="Arial"/>
+          <w:sz w:val="24"/>
+          <w:szCs w:val="24"/>
+        </w:rPr>
+        <w:t>check</w:t>
+      </w:r>
+      <w:r>
+        <w:rPr>
+          <w:rFonts w:ascii="Arial" w:hAnsi="Arial" w:cs="Arial"/>
+          <w:sz w:val="24"/>
+          <w:szCs w:val="24"/>
+        </w:rPr>
+        <w:t xml:space="preserve"> em uma refeição, quando abrir </w:t>
+      </w:r>
+      <w:r>
+        <w:rPr>
+          <w:rFonts w:ascii="Arial" w:hAnsi="Arial" w:cs="Arial"/>
+          <w:sz w:val="24"/>
+          <w:szCs w:val="24"/>
+        </w:rPr>
+        <w:t>a</w:t>
+      </w:r>
+      <w:r>
+        <w:rPr>
+          <w:rFonts w:ascii="Arial" w:hAnsi="Arial" w:cs="Arial"/>
+          <w:sz w:val="24"/>
+          <w:szCs w:val="24"/>
+        </w:rPr>
+        <w:t xml:space="preserve"> dashboar</w:t>
+      </w:r>
+      <w:r>
+        <w:rPr>
+          <w:rFonts w:ascii="Arial" w:hAnsi="Arial" w:cs="Arial"/>
+          <w:sz w:val="24"/>
+          <w:szCs w:val="24"/>
+        </w:rPr>
+        <w:t>d</w:t>
+      </w:r>
+      <w:r>
+        <w:rPr>
+          <w:rFonts w:ascii="Arial" w:hAnsi="Arial" w:cs="Arial"/>
+          <w:sz w:val="24"/>
+          <w:szCs w:val="24"/>
+        </w:rPr>
+        <w:t>, poderá ver as informações de calorias ingeridas aumentarem.</w:t>
+      </w:r>
+    </w:p>
+    <w:p>
+      <w:pPr>
+        <w:pStyle w:val="Normal"/>
+        <w:ind w:left="1416"/>
+        <w:rPr>
+          <w:rFonts w:ascii="Arial" w:hAnsi="Arial" w:cs="Arial"/>
+          <w:sz w:val="24"/>
+          <w:szCs w:val="24"/>
+        </w:rPr>
+      </w:pPr>
+      <w:r>
+        <w:rPr>
+          <w:rFonts w:ascii="Arial" w:hAnsi="Arial" w:cs="Arial"/>
+          <w:sz w:val="24"/>
+          <w:szCs w:val="24"/>
+        </w:rPr>
+        <w:t xml:space="preserve">b) </w:t>
+      </w:r>
+      <w:r>
+        <w:rPr>
+          <w:rFonts w:ascii="Arial" w:hAnsi="Arial" w:cs="Arial"/>
+          <w:sz w:val="24"/>
+          <w:szCs w:val="24"/>
+        </w:rPr>
+        <w:t xml:space="preserve">Dado que o usuário tenha refeições cadastradas, quando dar </w:t>
+      </w:r>
+      <w:r>
+        <w:rPr>
+          <w:rFonts w:ascii="Arial" w:hAnsi="Arial" w:cs="Arial"/>
+          <w:sz w:val="24"/>
+          <w:szCs w:val="24"/>
+        </w:rPr>
+        <w:t>check</w:t>
+      </w:r>
+      <w:r>
+        <w:rPr>
+          <w:rFonts w:ascii="Arial" w:hAnsi="Arial" w:cs="Arial"/>
+          <w:sz w:val="24"/>
+          <w:szCs w:val="24"/>
+        </w:rPr>
+        <w:t xml:space="preserve"> em uma refeição, então as dashboards serão atualizadas com no máximo 1s de atraso.</w:t>
+      </w:r>
+    </w:p>
+    <w:p>
+      <w:pPr>
+        <w:pStyle w:val="Normal"/>
+        <w:ind w:left="720"/>
+        <w:rPr>
+          <w:rFonts w:ascii="Arial" w:hAnsi="Arial" w:cs="Arial"/>
+          <w:sz w:val="24"/>
+          <w:szCs w:val="24"/>
+        </w:rPr>
+      </w:pPr>
+    </w:p>
+    <w:p>
+      <w:pPr>
+        <w:pStyle w:val="Normal"/>
+        <w:ind w:left="720"/>
+        <w:rPr>
+          <w:rFonts w:ascii="Arial" w:hAnsi="Arial" w:cs="Arial"/>
+          <w:sz w:val="24"/>
+          <w:szCs w:val="24"/>
+        </w:rPr>
+      </w:pPr>
+    </w:p>
+    <w:p>
+      <w:pPr>
+        <w:pStyle w:val="Normal"/>
+        <w:ind w:left="720"/>
+        <w:rPr>
+          <w:rFonts w:ascii="Arial" w:hAnsi="Arial" w:cs="Arial"/>
+          <w:sz w:val="24"/>
+          <w:szCs w:val="24"/>
+        </w:rPr>
+      </w:pPr>
+    </w:p>
+    <w:p>
+      <w:pPr>
+        <w:pStyle w:val="Normal"/>
+        <w:ind w:left="720"/>
+        <w:rPr>
+          <w:rFonts w:ascii="Arial" w:hAnsi="Arial" w:cs="Arial"/>
+          <w:sz w:val="24"/>
+          <w:szCs w:val="24"/>
+        </w:rPr>
+      </w:pPr>
+    </w:p>
+    <w:p>
+      <w:pPr>
+        <w:pStyle w:val="Normal"/>
+        <w:ind w:left="720"/>
+        <w:rPr>
+          <w:rFonts w:ascii="Arial" w:hAnsi="Arial" w:cs="Arial"/>
+          <w:sz w:val="24"/>
+          <w:szCs w:val="24"/>
+        </w:rPr>
+      </w:pPr>
+      <w:r>
+        <w:rPr>
+          <w:rFonts w:ascii="Arial" w:hAnsi="Arial" w:cs="Arial"/>
+          <w:sz w:val="24"/>
+          <w:szCs w:val="24"/>
+        </w:rPr>
+        <w:t>4. Editar refeição:</w:t>
+      </w:r>
+    </w:p>
+    <w:p>
+      <w:pPr>
+        <w:pStyle w:val="Normal"/>
+        <w:ind w:firstLine="708"/>
+        <w:rPr>
+          <w:rFonts w:ascii="Arial" w:hAnsi="Arial" w:cs="Arial"/>
+          <w:sz w:val="24"/>
+          <w:szCs w:val="24"/>
+        </w:rPr>
+      </w:pPr>
+      <w:r>
+        <w:br/>
+      </w:r>
+      <w:r>
+        <w:tab/>
+      </w:r>
+      <w:r>
+        <w:tab/>
+      </w:r>
+      <w:r>
+        <w:rPr>
+          <w:rFonts w:ascii="Arial" w:hAnsi="Arial" w:cs="Arial"/>
+          <w:sz w:val="24"/>
+          <w:szCs w:val="24"/>
+        </w:rPr>
+        <w:t xml:space="preserve">a)  </w:t>
+      </w:r>
+    </w:p>
+    <w:p>
+      <w:pPr>
+        <w:pStyle w:val="PargrafodaLista"/>
+        <w:numPr>
+          <w:ilvl w:val="0"/>
+          <w:numId w:val="3"/>
+        </w:numPr>
+        <w:suppressLineNumbers w:val="0"/>
+        <w:bidi w:val="0"/>
+        <w:spacing w:before="0" w:beforeAutospacing="off" w:after="160" w:afterAutospacing="off" w:line="259" w:lineRule="auto"/>
+        <w:ind w:left="1788" w:right="0" w:hanging="360"/>
+        <w:jc w:val="left"/>
+        <w:rPr>
+          <w:rFonts w:ascii="Arial" w:hAnsi="Arial" w:cs="Arial"/>
+          <w:sz w:val="24"/>
+          <w:szCs w:val="24"/>
+        </w:rPr>
+      </w:pPr>
+      <w:r>
+        <w:rPr>
+          <w:rFonts w:ascii="Arial" w:hAnsi="Arial" w:cs="Arial"/>
+          <w:sz w:val="24"/>
+          <w:szCs w:val="24"/>
+        </w:rPr>
+        <w:t xml:space="preserve">Dado que o usuário tenha </w:t>
+      </w:r>
+      <w:r>
+        <w:rPr>
+          <w:rFonts w:ascii="Arial" w:hAnsi="Arial" w:cs="Arial"/>
+          <w:sz w:val="24"/>
+          <w:szCs w:val="24"/>
+        </w:rPr>
+        <w:t>apertado em editar refeição, quando preencher os dados corretamente e clicar em “Confirmar edição”, então o sistema irá redirecioná-lo para a tela inicial onde poderá ver a refeição com as novas informações.</w:t>
+      </w:r>
+    </w:p>
+    <w:p>
+      <w:pPr>
+        <w:pStyle w:val="PargrafodaLista"/>
+        <w:numPr>
+          <w:ilvl w:val="0"/>
+          <w:numId w:val="3"/>
+        </w:numPr>
+        <w:suppressLineNumbers w:val="0"/>
+        <w:bidi w:val="0"/>
+        <w:spacing w:before="0" w:beforeAutospacing="off" w:after="160" w:afterAutospacing="off" w:line="259" w:lineRule="auto"/>
+        <w:ind w:left="1788" w:right="0" w:hanging="360"/>
+        <w:jc w:val="left"/>
+        <w:rPr>
+          <w:rFonts w:ascii="Arial" w:hAnsi="Arial" w:cs="Arial"/>
+          <w:sz w:val="24"/>
+          <w:szCs w:val="24"/>
+        </w:rPr>
+      </w:pPr>
+      <w:r>
+        <w:rPr>
+          <w:rFonts w:ascii="Arial" w:hAnsi="Arial" w:cs="Arial"/>
+          <w:sz w:val="24"/>
+          <w:szCs w:val="24"/>
+        </w:rPr>
+        <w:t xml:space="preserve">Dado que o usuário tenha </w:t>
+      </w:r>
+      <w:r>
+        <w:rPr>
+          <w:rFonts w:ascii="Arial" w:hAnsi="Arial" w:cs="Arial"/>
+          <w:sz w:val="24"/>
+          <w:szCs w:val="24"/>
+        </w:rPr>
+        <w:t>editado uma refeição</w:t>
+      </w:r>
+      <w:r>
+        <w:rPr>
+          <w:rFonts w:ascii="Arial" w:hAnsi="Arial" w:cs="Arial"/>
+          <w:sz w:val="24"/>
+          <w:szCs w:val="24"/>
+        </w:rPr>
+        <w:t xml:space="preserve">, quando abrir os dashboards, </w:t>
+      </w:r>
+      <w:r>
+        <w:rPr>
+          <w:rFonts w:ascii="Arial" w:hAnsi="Arial" w:cs="Arial"/>
+          <w:sz w:val="24"/>
+          <w:szCs w:val="24"/>
+        </w:rPr>
+        <w:t>irá ver os</w:t>
+      </w:r>
+      <w:r>
+        <w:rPr>
+          <w:rFonts w:ascii="Arial" w:hAnsi="Arial" w:cs="Arial"/>
+          <w:sz w:val="24"/>
+          <w:szCs w:val="24"/>
+        </w:rPr>
+        <w:t xml:space="preserve"> gráficos da</w:t>
+      </w:r>
+      <w:r>
+        <w:rPr>
+          <w:rFonts w:ascii="Arial" w:hAnsi="Arial" w:cs="Arial"/>
+          <w:sz w:val="24"/>
+          <w:szCs w:val="24"/>
+        </w:rPr>
+        <w:t xml:space="preserve"> dashboard com as novas informações de nutrientes e calorias</w:t>
+      </w:r>
+      <w:r>
+        <w:rPr>
+          <w:rFonts w:ascii="Arial" w:hAnsi="Arial" w:cs="Arial"/>
+          <w:sz w:val="24"/>
+          <w:szCs w:val="24"/>
+        </w:rPr>
+        <w:t>.</w:t>
+      </w:r>
+    </w:p>
+    <w:p>
+      <w:pPr>
+        <w:pStyle w:val="Normal"/>
+        <w:ind w:left="1416"/>
+        <w:rPr>
+          <w:rFonts w:ascii="Arial" w:hAnsi="Arial" w:cs="Arial"/>
+          <w:sz w:val="24"/>
+          <w:szCs w:val="24"/>
+        </w:rPr>
+      </w:pPr>
+      <w:r>
+        <w:rPr>
+          <w:rFonts w:ascii="Arial" w:hAnsi="Arial" w:cs="Arial"/>
+          <w:sz w:val="24"/>
+          <w:szCs w:val="24"/>
+        </w:rPr>
+        <w:t xml:space="preserve">b) </w:t>
+      </w:r>
+      <w:r>
+        <w:rPr>
+          <w:rFonts w:ascii="Arial" w:hAnsi="Arial" w:cs="Arial"/>
+          <w:sz w:val="24"/>
+          <w:szCs w:val="24"/>
+        </w:rPr>
+        <w:t>Dado que o usuário não esteja conectado à internet e tenha editado uma refeição, quando se conectar novamente a internet, então os novos dados da refeição serão enviados para a nuvem.</w:t>
+      </w:r>
+    </w:p>
+    <w:p>
+      <w:pPr>
+        <w:pStyle w:val="Normal"/>
+        <w:ind w:left="1416"/>
+        <w:rPr>
+          <w:rFonts w:ascii="Arial" w:hAnsi="Arial" w:cs="Arial"/>
+          <w:sz w:val="24"/>
+          <w:szCs w:val="24"/>
+        </w:rPr>
+      </w:pPr>
+    </w:p>
+    <w:p>
+      <w:pPr>
+        <w:pStyle w:val="Normal"/>
+        <w:ind w:left="0"/>
+        <w:rPr>
+          <w:rFonts w:ascii="Arial" w:hAnsi="Arial" w:cs="Arial"/>
+          <w:sz w:val="24"/>
+          <w:szCs w:val="24"/>
+        </w:rPr>
+      </w:pPr>
+      <w:r>
+        <w:rPr>
+          <w:rFonts w:ascii="Arial" w:hAnsi="Arial" w:cs="Arial"/>
+          <w:sz w:val="24"/>
+          <w:szCs w:val="24"/>
+        </w:rPr>
+        <w:t xml:space="preserve">5. </w:t>
+      </w:r>
+      <w:r>
+        <w:rPr>
+          <w:rFonts w:ascii="Arial" w:hAnsi="Arial" w:cs="Arial"/>
+          <w:sz w:val="24"/>
+          <w:szCs w:val="24"/>
+        </w:rPr>
+        <w:t>Notificações de lembrete:</w:t>
+      </w:r>
+    </w:p>
+    <w:p>
+      <w:pPr>
+        <w:pStyle w:val="Normal"/>
+        <w:ind w:firstLine="708"/>
+        <w:rPr>
+          <w:rFonts w:ascii="Arial" w:hAnsi="Arial" w:cs="Arial"/>
+          <w:sz w:val="24"/>
+          <w:szCs w:val="24"/>
+        </w:rPr>
+      </w:pPr>
+      <w:r>
+        <w:rPr>
+          <w:rFonts w:ascii="Arial" w:hAnsi="Arial" w:cs="Arial"/>
+          <w:sz w:val="24"/>
+          <w:szCs w:val="24"/>
+        </w:rPr>
+        <w:t xml:space="preserve">a)  </w:t>
+      </w:r>
+    </w:p>
+    <w:p>
+      <w:pPr>
+        <w:pStyle w:val="PargrafodaLista"/>
+        <w:numPr>
+          <w:ilvl w:val="0"/>
+          <w:numId w:val="3"/>
+        </w:numPr>
+        <w:suppressLineNumbers w:val="0"/>
+        <w:bidi w:val="0"/>
+        <w:spacing w:before="0" w:beforeAutospacing="off" w:after="160" w:afterAutospacing="off" w:line="259" w:lineRule="auto"/>
+        <w:ind w:left="1788" w:right="0" w:hanging="360"/>
+        <w:jc w:val="left"/>
+        <w:rPr>
+          <w:rFonts w:ascii="Arial" w:hAnsi="Arial" w:cs="Arial"/>
+          <w:sz w:val="24"/>
+          <w:szCs w:val="24"/>
+        </w:rPr>
+      </w:pPr>
+      <w:r>
+        <w:rPr>
+          <w:rFonts w:ascii="Arial" w:hAnsi="Arial" w:cs="Arial"/>
+          <w:sz w:val="24"/>
+          <w:szCs w:val="24"/>
+        </w:rPr>
+        <w:t xml:space="preserve">Dado que o usuário tenha uma refeição cadastrada, quando chegar </w:t>
+      </w:r>
+      <w:r>
+        <w:rPr>
+          <w:rFonts w:ascii="Arial" w:hAnsi="Arial" w:cs="Arial"/>
+          <w:sz w:val="24"/>
+          <w:szCs w:val="24"/>
+        </w:rPr>
+        <w:t>a até 1</w:t>
+      </w:r>
+      <w:r>
+        <w:rPr>
+          <w:rFonts w:ascii="Arial" w:hAnsi="Arial" w:cs="Arial"/>
+          <w:sz w:val="24"/>
+          <w:szCs w:val="24"/>
+        </w:rPr>
+        <w:t xml:space="preserve"> minuto antes do horário cadastrado, então receberá uma notificação com um lembrete.</w:t>
+      </w:r>
+    </w:p>
+    <w:p>
+      <w:pPr>
+        <w:pStyle w:val="PargrafodaLista"/>
+        <w:numPr>
+          <w:ilvl w:val="0"/>
+          <w:numId w:val="3"/>
+        </w:numPr>
+        <w:suppressLineNumbers w:val="0"/>
+        <w:bidi w:val="0"/>
+        <w:spacing w:before="0" w:beforeAutospacing="off" w:after="160" w:afterAutospacing="off" w:line="259" w:lineRule="auto"/>
+        <w:ind w:left="1788" w:right="0" w:hanging="360"/>
+        <w:jc w:val="left"/>
+        <w:rPr>
+          <w:rFonts w:ascii="Arial" w:hAnsi="Arial" w:cs="Arial"/>
+          <w:sz w:val="24"/>
+          <w:szCs w:val="24"/>
+        </w:rPr>
+      </w:pPr>
+      <w:r>
+        <w:rPr>
+          <w:rFonts w:ascii="Arial" w:hAnsi="Arial" w:cs="Arial"/>
+          <w:sz w:val="24"/>
+          <w:szCs w:val="24"/>
+        </w:rPr>
+        <w:t xml:space="preserve">Dado que o usuário tenha </w:t>
+      </w:r>
+      <w:r>
+        <w:rPr>
+          <w:rFonts w:ascii="Arial" w:hAnsi="Arial" w:cs="Arial"/>
+          <w:sz w:val="24"/>
+          <w:szCs w:val="24"/>
+        </w:rPr>
+        <w:t>recebido uma notificação, quando clicar nela, então o aplicativo abrirá na tela da refeição referente à notificação.</w:t>
+      </w:r>
+    </w:p>
+    <w:p>
+      <w:pPr>
+        <w:pStyle w:val="Normal"/>
+        <w:ind w:left="1416"/>
+        <w:rPr>
+          <w:rFonts w:ascii="Arial" w:hAnsi="Arial" w:cs="Arial"/>
+          <w:sz w:val="24"/>
+          <w:szCs w:val="24"/>
+        </w:rPr>
+      </w:pPr>
+      <w:r>
+        <w:rPr>
+          <w:rFonts w:ascii="Arial" w:hAnsi="Arial" w:cs="Arial"/>
+          <w:sz w:val="24"/>
+          <w:szCs w:val="24"/>
+        </w:rPr>
+        <w:t>b) Dado que o usuário não esteja conectado à internet e tenha editado uma refeição, quando se conectar novamente a internet, então os novos dados da refeição serão enviados para a nuvem.</w:t>
+      </w:r>
+    </w:p>
+    <w:p>
+      <w:pPr>
+        <w:pStyle w:val="Normal"/>
+        <w:ind w:left="1416"/>
+        <w:rPr>
+          <w:rFonts w:ascii="Arial" w:hAnsi="Arial" w:cs="Arial"/>
+          <w:sz w:val="24"/>
+          <w:szCs w:val="24"/>
+        </w:rPr>
+      </w:pPr>
+    </w:p>
+    <w:p>
+      <w:pPr>
+        <w:pStyle w:val="Normal"/>
+        <w:ind w:left="708"/>
+        <w:rPr>
+          <w:rFonts w:ascii="Arial" w:hAnsi="Arial" w:cs="Arial"/>
+          <w:sz w:val="24"/>
+          <w:szCs w:val="24"/>
+        </w:rPr>
+      </w:pPr>
+      <w:r>
+        <w:rPr>
+          <w:rFonts w:ascii="Arial" w:hAnsi="Arial" w:cs="Arial"/>
+          <w:sz w:val="24"/>
+          <w:szCs w:val="24"/>
+        </w:rPr>
+        <w:t>6. Dashboards interativos</w:t>
+      </w:r>
+    </w:p>
+    <w:p>
+      <w:pPr>
+        <w:pStyle w:val="Normal"/>
+        <w:ind w:left="708" w:firstLine="708"/>
+        <w:rPr>
+          <w:rFonts w:ascii="Arial" w:hAnsi="Arial" w:cs="Arial"/>
+          <w:sz w:val="24"/>
+          <w:szCs w:val="24"/>
+        </w:rPr>
+      </w:pPr>
+      <w:r>
+        <w:rPr>
+          <w:rFonts w:ascii="Arial" w:hAnsi="Arial" w:cs="Arial"/>
+          <w:sz w:val="24"/>
+          <w:szCs w:val="24"/>
+        </w:rPr>
+        <w:t xml:space="preserve">a)  </w:t>
+      </w:r>
+    </w:p>
+    <w:p>
+      <w:pPr>
+        <w:pStyle w:val="PargrafodaLista"/>
+        <w:numPr>
+          <w:ilvl w:val="0"/>
+          <w:numId w:val="3"/>
+        </w:numPr>
+        <w:suppressLineNumbers w:val="0"/>
+        <w:bidi w:val="0"/>
+        <w:spacing w:before="0" w:beforeAutospacing="off" w:after="160" w:afterAutospacing="off" w:line="259" w:lineRule="auto"/>
+        <w:ind w:left="1788" w:right="0" w:hanging="360"/>
+        <w:jc w:val="left"/>
+        <w:rPr>
+          <w:rFonts w:ascii="Arial" w:hAnsi="Arial" w:cs="Arial"/>
+          <w:sz w:val="24"/>
+          <w:szCs w:val="24"/>
+        </w:rPr>
+      </w:pPr>
+      <w:r>
+        <w:rPr>
+          <w:rFonts w:ascii="Arial" w:hAnsi="Arial" w:cs="Arial"/>
+          <w:sz w:val="24"/>
+          <w:szCs w:val="24"/>
+        </w:rPr>
+        <w:t xml:space="preserve">Dado que o usuário </w:t>
+      </w:r>
+      <w:r>
+        <w:rPr>
+          <w:rFonts w:ascii="Arial" w:hAnsi="Arial" w:cs="Arial"/>
+          <w:sz w:val="24"/>
+          <w:szCs w:val="24"/>
+        </w:rPr>
+        <w:t xml:space="preserve">tenha </w:t>
+      </w:r>
+      <w:r>
+        <w:rPr>
+          <w:rFonts w:ascii="Arial" w:hAnsi="Arial" w:cs="Arial"/>
+          <w:sz w:val="24"/>
+          <w:szCs w:val="24"/>
+        </w:rPr>
+        <w:t>cadastrado uma nova</w:t>
+      </w:r>
+      <w:r>
+        <w:rPr>
+          <w:rFonts w:ascii="Arial" w:hAnsi="Arial" w:cs="Arial"/>
+          <w:sz w:val="24"/>
+          <w:szCs w:val="24"/>
+        </w:rPr>
+        <w:t>, quando abrir a dashboard, os limites dos gráficos serão atualizados com a quantidade de calorias e nutrientes do total das refeições.</w:t>
+      </w:r>
+    </w:p>
+    <w:p>
+      <w:pPr>
+        <w:pStyle w:val="PargrafodaLista"/>
+        <w:numPr>
+          <w:ilvl w:val="0"/>
+          <w:numId w:val="3"/>
+        </w:numPr>
+        <w:suppressLineNumbers w:val="0"/>
+        <w:bidi w:val="0"/>
+        <w:spacing w:before="0" w:beforeAutospacing="off" w:after="160" w:afterAutospacing="off" w:line="259" w:lineRule="auto"/>
+        <w:ind w:left="1788" w:right="0" w:hanging="360"/>
+        <w:jc w:val="left"/>
+        <w:rPr>
+          <w:rFonts w:ascii="Arial" w:hAnsi="Arial" w:cs="Arial"/>
+          <w:sz w:val="24"/>
+          <w:szCs w:val="24"/>
+        </w:rPr>
+      </w:pPr>
+      <w:r>
+        <w:rPr>
+          <w:rFonts w:ascii="Arial" w:hAnsi="Arial" w:cs="Arial"/>
+          <w:sz w:val="24"/>
+          <w:szCs w:val="24"/>
+        </w:rPr>
+        <w:t>Dado que o usuário esteja na tela de dashboard, quando selecionar um filtro de data, então o sistema deverá mostrar apenas as informações do período selecionado.</w:t>
+      </w:r>
+    </w:p>
+    <w:p>
+      <w:pPr>
+        <w:pStyle w:val="Normal"/>
+        <w:ind w:left="1416"/>
+        <w:rPr>
+          <w:rFonts w:ascii="Arial" w:hAnsi="Arial" w:cs="Arial"/>
+          <w:sz w:val="24"/>
+          <w:szCs w:val="24"/>
+        </w:rPr>
+      </w:pPr>
+      <w:r>
+        <w:rPr>
+          <w:rFonts w:ascii="Arial" w:hAnsi="Arial" w:cs="Arial"/>
+          <w:sz w:val="24"/>
+          <w:szCs w:val="24"/>
+        </w:rPr>
+        <w:t>b) Dad</w:t>
+      </w:r>
+      <w:r>
+        <w:rPr>
+          <w:rFonts w:ascii="Arial" w:hAnsi="Arial" w:cs="Arial"/>
+          <w:sz w:val="24"/>
+          <w:szCs w:val="24"/>
+        </w:rPr>
+        <w:t>o que o usuário tenha cadastrado uma nova refeição, quando abrir a tela de dashboard, verá que os gráficos serão atualizados com cores diferentes para cada nutriente, melhorando a usabilidade.</w:t>
+      </w:r>
+    </w:p>
+    <w:p>
+      <w:pPr>
+        <w:pStyle w:val="Normal"/>
+        <w:ind w:left="1416"/>
+        <w:rPr>
+          <w:rFonts w:ascii="Arial" w:hAnsi="Arial" w:cs="Arial"/>
+          <w:sz w:val="24"/>
+          <w:szCs w:val="24"/>
+        </w:rPr>
+      </w:pPr>
+    </w:p>
+    <w:p>
+      <w:pPr>
+        <w:pStyle w:val="Normal"/>
+        <w:ind w:left="708"/>
+        <w:rPr>
+          <w:rFonts w:ascii="Arial" w:hAnsi="Arial" w:cs="Arial"/>
+          <w:sz w:val="24"/>
+          <w:szCs w:val="24"/>
+        </w:rPr>
+      </w:pPr>
+      <w:r>
+        <w:rPr>
+          <w:rFonts w:ascii="Arial" w:hAnsi="Arial" w:cs="Arial"/>
+          <w:sz w:val="24"/>
+          <w:szCs w:val="24"/>
+        </w:rPr>
+        <w:t>7.</w:t>
+      </w:r>
+      <w:r>
+        <w:rPr>
+          <w:rFonts w:ascii="Arial" w:hAnsi="Arial" w:cs="Arial"/>
+          <w:sz w:val="24"/>
+          <w:szCs w:val="24"/>
+        </w:rPr>
+        <w:t xml:space="preserve"> </w:t>
+      </w:r>
+      <w:r>
+        <w:rPr>
+          <w:rFonts w:ascii="Arial" w:hAnsi="Arial" w:cs="Arial"/>
+          <w:sz w:val="24"/>
+          <w:szCs w:val="24"/>
+        </w:rPr>
+        <w:t>Compartilhamento e/ou exportação de métricas da dieta</w:t>
+      </w:r>
+      <w:r>
+        <w:br/>
+      </w:r>
+      <w:r>
+        <w:tab/>
+      </w:r>
+    </w:p>
+    <w:p>
+      <w:pPr>
+        <w:pStyle w:val="Normal"/>
+        <w:ind w:left="708" w:firstLine="708"/>
+        <w:rPr>
+          <w:rFonts w:ascii="Arial" w:hAnsi="Arial" w:cs="Arial"/>
+          <w:sz w:val="24"/>
+          <w:szCs w:val="24"/>
+        </w:rPr>
+      </w:pPr>
+      <w:r>
+        <w:rPr>
+          <w:rFonts w:ascii="Arial" w:hAnsi="Arial" w:cs="Arial"/>
+          <w:sz w:val="24"/>
+          <w:szCs w:val="24"/>
+        </w:rPr>
+        <w:t xml:space="preserve">a)  </w:t>
+      </w:r>
+    </w:p>
+    <w:p>
+      <w:pPr>
+        <w:pStyle w:val="PargrafodaLista"/>
+        <w:numPr>
+          <w:ilvl w:val="0"/>
+          <w:numId w:val="3"/>
+        </w:numPr>
+        <w:suppressLineNumbers w:val="0"/>
+        <w:bidi w:val="0"/>
+        <w:spacing w:before="0" w:beforeAutospacing="off" w:after="160" w:afterAutospacing="off" w:line="259" w:lineRule="auto"/>
+        <w:ind w:left="1788" w:right="0" w:hanging="360"/>
+        <w:jc w:val="left"/>
+        <w:rPr>
+          <w:rFonts w:ascii="Arial" w:hAnsi="Arial" w:cs="Arial"/>
+          <w:sz w:val="24"/>
+          <w:szCs w:val="24"/>
+        </w:rPr>
+      </w:pPr>
+      <w:r>
+        <w:rPr>
+          <w:rFonts w:ascii="Arial" w:hAnsi="Arial" w:cs="Arial"/>
+          <w:sz w:val="24"/>
+          <w:szCs w:val="24"/>
+        </w:rPr>
+        <w:t>Dado que o usuário esteja na tela do dashboard, quando clicar em “Exportar relatório”</w:t>
+      </w:r>
+      <w:r>
+        <w:rPr>
+          <w:rFonts w:ascii="Arial" w:hAnsi="Arial" w:cs="Arial"/>
+          <w:sz w:val="24"/>
+          <w:szCs w:val="24"/>
+        </w:rPr>
+        <w:t xml:space="preserve"> na opção PDF</w:t>
+      </w:r>
+      <w:r>
+        <w:rPr>
+          <w:rFonts w:ascii="Arial" w:hAnsi="Arial" w:cs="Arial"/>
+          <w:sz w:val="24"/>
+          <w:szCs w:val="24"/>
+        </w:rPr>
+        <w:t>, então o sistema irá gerar um arquivo PDF com as métricas da dieta e salvará no d</w:t>
+      </w:r>
+      <w:r>
+        <w:rPr>
+          <w:rFonts w:ascii="Arial" w:hAnsi="Arial" w:cs="Arial"/>
+          <w:sz w:val="24"/>
+          <w:szCs w:val="24"/>
+        </w:rPr>
+        <w:t>ispositivo.</w:t>
+      </w:r>
+    </w:p>
+    <w:p>
+      <w:pPr>
+        <w:pStyle w:val="PargrafodaLista"/>
+        <w:numPr>
+          <w:ilvl w:val="0"/>
+          <w:numId w:val="3"/>
+        </w:numPr>
+        <w:suppressLineNumbers w:val="0"/>
+        <w:bidi w:val="0"/>
+        <w:spacing w:before="0" w:beforeAutospacing="off" w:after="160" w:afterAutospacing="off" w:line="259" w:lineRule="auto"/>
+        <w:ind w:left="1788" w:right="0" w:hanging="360"/>
+        <w:jc w:val="left"/>
+        <w:rPr>
+          <w:rFonts w:ascii="Arial" w:hAnsi="Arial" w:cs="Arial"/>
+          <w:sz w:val="24"/>
+          <w:szCs w:val="24"/>
+        </w:rPr>
+      </w:pPr>
+      <w:r>
+        <w:rPr>
+          <w:rFonts w:ascii="Arial" w:hAnsi="Arial" w:cs="Arial"/>
+          <w:sz w:val="24"/>
+          <w:szCs w:val="24"/>
+        </w:rPr>
+        <w:t>Dado que o usuário esteja na tela d</w:t>
+      </w:r>
+      <w:r>
+        <w:rPr>
+          <w:rFonts w:ascii="Arial" w:hAnsi="Arial" w:cs="Arial"/>
+          <w:sz w:val="24"/>
+          <w:szCs w:val="24"/>
+        </w:rPr>
+        <w:t>o</w:t>
+      </w:r>
+      <w:r>
+        <w:rPr>
+          <w:rFonts w:ascii="Arial" w:hAnsi="Arial" w:cs="Arial"/>
+          <w:sz w:val="24"/>
+          <w:szCs w:val="24"/>
+        </w:rPr>
+        <w:t xml:space="preserve"> dashboard, quando </w:t>
+      </w:r>
+      <w:r>
+        <w:rPr>
+          <w:rFonts w:ascii="Arial" w:hAnsi="Arial" w:cs="Arial"/>
+          <w:sz w:val="24"/>
+          <w:szCs w:val="24"/>
+        </w:rPr>
+        <w:t>clicar em “Compartilhar”, então o sistema irá abrir a tela nativa do sistema operacional com as opções de compartilhamento.</w:t>
+      </w:r>
+    </w:p>
+    <w:p>
+      <w:pPr>
+        <w:pStyle w:val="Normal"/>
+        <w:ind w:left="1416"/>
+        <w:rPr>
+          <w:rFonts w:ascii="Arial" w:hAnsi="Arial" w:cs="Arial"/>
+          <w:sz w:val="24"/>
+          <w:szCs w:val="24"/>
+        </w:rPr>
+      </w:pPr>
+      <w:r>
+        <w:rPr>
+          <w:rFonts w:ascii="Arial" w:hAnsi="Arial" w:cs="Arial"/>
+          <w:sz w:val="24"/>
+          <w:szCs w:val="24"/>
+        </w:rPr>
+        <w:t xml:space="preserve">b) Dado que o usuário </w:t>
+      </w:r>
+      <w:r>
+        <w:rPr>
+          <w:rFonts w:ascii="Arial" w:hAnsi="Arial" w:cs="Arial"/>
+          <w:sz w:val="24"/>
+          <w:szCs w:val="24"/>
+        </w:rPr>
+        <w:t>esteja na tela do dashboard</w:t>
+      </w:r>
+      <w:r>
+        <w:rPr>
+          <w:rFonts w:ascii="Arial" w:hAnsi="Arial" w:cs="Arial"/>
+          <w:sz w:val="24"/>
+          <w:szCs w:val="24"/>
+        </w:rPr>
+        <w:t>, quando clicar em “Exportar relatório”, então o sistema deverá disponibilizar a exportação em PDF, JPG e PNG.</w:t>
+      </w:r>
+    </w:p>
+    <w:p>
+      <w:pPr>
+        <w:pStyle w:val="Normal"/>
+        <w:ind w:left="708"/>
+        <w:rPr>
+          <w:rFonts w:ascii="Arial" w:hAnsi="Arial" w:cs="Arial"/>
+          <w:sz w:val="24"/>
+          <w:szCs w:val="24"/>
+        </w:rPr>
+      </w:pPr>
+    </w:p>
+    <w:p>
+      <w:pPr>
+        <w:pStyle w:val="Normal"/>
+        <w:ind w:left="708"/>
+      </w:pPr>
+    </w:p>
+    <w:p>
+      <w:pPr>
+        <w:pStyle w:val="Normal"/>
+        <w:ind w:left="708"/>
+        <w:rPr>
+          <w:rFonts w:ascii="Arial" w:hAnsi="Arial" w:cs="Arial"/>
+          <w:sz w:val="24"/>
+          <w:szCs w:val="24"/>
+        </w:rPr>
+      </w:pPr>
+    </w:p>
+    <w:p>
+      <w:pPr>
+        <w:pStyle w:val="Normal"/>
+        <w:ind w:left="0"/>
+        <w:rPr>
+          <w:rFonts w:ascii="Arial" w:hAnsi="Arial" w:cs="Arial"/>
+          <w:sz w:val="24"/>
+          <w:szCs w:val="24"/>
+        </w:rPr>
+      </w:pPr>
+    </w:p>
+    <w:p>
+      <w:pPr>
+        <w:pStyle w:val="Normal"/>
+        <w:ind w:left="0"/>
+        <w:rPr>
+          <w:rFonts w:ascii="Arial" w:hAnsi="Arial" w:cs="Arial"/>
+          <w:sz w:val="24"/>
+          <w:szCs w:val="24"/>
+        </w:rPr>
+      </w:pPr>
+    </w:p>
+    <w:p>
+      <w:pPr>
+        <w:pStyle w:val="Normal"/>
+        <w:ind w:left="708"/>
+        <w:rPr>
+          <w:rFonts w:ascii="Arial" w:hAnsi="Arial" w:cs="Arial"/>
+          <w:sz w:val="24"/>
+          <w:szCs w:val="24"/>
+        </w:rPr>
+      </w:pPr>
+    </w:p>
+    <w:p>
+      <w:pPr>
+        <w:pStyle w:val="PargrafodaLista"/>
+        <w:ind w:firstLine="708"/>
+        <w:rPr>
+          <w:rFonts w:ascii="Arial" w:hAnsi="Arial" w:cs="Arial"/>
+          <w:sz w:val="24"/>
+          <w:szCs w:val="24"/>
+        </w:rPr>
+      </w:pPr>
+    </w:p>
+    <w:p>
+      <w:pPr>
+        <w:pStyle w:val="PargrafodaLista"/>
+        <w:ind w:firstLine="708"/>
+        <w:rPr>
+          <w:rFonts w:ascii="Arial" w:hAnsi="Arial" w:cs="Arial"/>
+          <w:sz w:val="24"/>
+          <w:szCs w:val="24"/>
+        </w:rPr>
+      </w:pPr>
+    </w:p>
     <w:sectPr>
-      <w:pgSz w:w="11906" w:h="16838"/>
+      <w:pgSz w:w="11906" w:h="16838" w:orient="portrait"/>
       <w:pgMar w:top="1417" w:right="1701" w:bottom="1417" w:left="1701" w:header="708" w:footer="708" w:gutter="0"/>
       <w:cols w:space="708"/>
       <w:docGrid w:linePitch="360"/>
@@ -2992,6 +4554,118 @@
 
 <file path=word/numbering.xml><?xml version="1.0" encoding="utf-8"?>
 <w:numbering xmlns:wpc="http://schemas.microsoft.com/office/word/2010/wordprocessingCanvas" xmlns:cx="http://schemas.microsoft.com/office/drawing/2014/chartex" xmlns:cx1="http://schemas.microsoft.com/office/drawing/2015/9/8/chartex" xmlns:cx2="http://schemas.microsoft.com/office/drawing/2015/10/21/chartex" xmlns:cx3="http://schemas.microsoft.com/office/drawing/2016/5/9/chartex" xmlns:cx4="http://schemas.microsoft.com/office/drawing/2016/5/10/chartex" xmlns:cx5="http://schemas.microsoft.com/office/drawing/2016/5/11/chartex" xmlns:cx6="http://schemas.microsoft.com/office/drawing/2016/5/12/chartex" xmlns:cx7="http://schemas.microsoft.com/office/drawing/2016/5/13/chartex" xmlns:cx8="http://schemas.microsoft.com/office/drawing/2016/5/14/chartex" xmlns:mc="http://schemas.openxmlformats.org/markup-compatibility/2006" xmlns:aink="http://schemas.microsoft.com/office/drawing/2016/ink" xmlns:am3d="http://schemas.microsoft.com/office/drawing/2017/model3d" xmlns:o="urn:schemas-microsoft-com:office:office" xmlns:r="http://schemas.openxmlformats.org/officeDocument/2006/relationships" xmlns:m="http://schemas.openxmlformats.org/officeDocument/2006/math" xmlns:v="urn:schemas-microsoft-com:vml" xmlns:wp14="http://schemas.microsoft.com/office/word/2010/wordprocessingDrawing" xmlns:wp="http://schemas.openxmlformats.org/drawingml/2006/wordprocessingDrawing" xmlns:w10="urn:schemas-microsoft-com:office:word" xmlns:w="http://schemas.openxmlformats.org/wordprocessingml/2006/main" xmlns:w14="http://schemas.microsoft.com/office/word/2010/wordml" xmlns:w15="http://schemas.microsoft.com/office/word/2012/wordml" xmlns:w16cex="http://schemas.microsoft.com/office/word/2018/wordml/cex" xmlns:w16cid="http://schemas.microsoft.com/office/word/2016/wordml/cid" xmlns:w16="http://schemas.microsoft.com/office/word/2018/wordml" xmlns:w16sdtdh="http://schemas.microsoft.com/office/word/2020/wordml/sdtdatahash" xmlns:w16se="http://schemas.microsoft.com/office/word/2015/wordml/symex" xmlns:wpg="http://schemas.microsoft.com/office/word/2010/wordprocessingGroup" xmlns:wpi="http://schemas.microsoft.com/office/word/2010/wordprocessingInk" xmlns:wne="http://schemas.microsoft.com/office/word/2006/wordml" xmlns:wps="http://schemas.microsoft.com/office/word/2010/wordprocessingShape" mc:Ignorable="w14 w15 w16se w16cid w16 w16cex w16sdtdh wp14">
+  <w:abstractNum xmlns:w="http://schemas.openxmlformats.org/wordprocessingml/2006/main" w:abstractNumId="2">
+    <w:nsid w:val="12cd1be0"/>
+    <w:multiLevelType xmlns:w="http://schemas.openxmlformats.org/wordprocessingml/2006/main" w:val="hybridMultilevel"/>
+    <w:lvl xmlns:w="http://schemas.openxmlformats.org/wordprocessingml/2006/main" w:ilvl="0">
+      <w:start w:val="1"/>
+      <w:numFmt w:val="bullet"/>
+      <w:lvlText w:val=""/>
+      <w:lvlJc w:val="left"/>
+      <w:pPr>
+        <w:ind w:left="1788" w:hanging="360"/>
+      </w:pPr>
+      <w:rPr>
+        <w:rFonts w:hint="default" w:ascii="Symbol" w:hAnsi="Symbol"/>
+      </w:rPr>
+    </w:lvl>
+    <w:lvl xmlns:w="http://schemas.openxmlformats.org/wordprocessingml/2006/main" w:ilvl="1">
+      <w:start w:val="1"/>
+      <w:numFmt w:val="bullet"/>
+      <w:lvlText w:val="o"/>
+      <w:lvlJc w:val="left"/>
+      <w:pPr>
+        <w:ind w:left="2508" w:hanging="360"/>
+      </w:pPr>
+      <w:rPr>
+        <w:rFonts w:hint="default" w:ascii="Courier New" w:hAnsi="Courier New"/>
+      </w:rPr>
+    </w:lvl>
+    <w:lvl xmlns:w="http://schemas.openxmlformats.org/wordprocessingml/2006/main" w:ilvl="2">
+      <w:start w:val="1"/>
+      <w:numFmt w:val="bullet"/>
+      <w:lvlText w:val=""/>
+      <w:lvlJc w:val="left"/>
+      <w:pPr>
+        <w:ind w:left="3228" w:hanging="360"/>
+      </w:pPr>
+      <w:rPr>
+        <w:rFonts w:hint="default" w:ascii="Wingdings" w:hAnsi="Wingdings"/>
+      </w:rPr>
+    </w:lvl>
+    <w:lvl xmlns:w="http://schemas.openxmlformats.org/wordprocessingml/2006/main" w:ilvl="3">
+      <w:start w:val="1"/>
+      <w:numFmt w:val="bullet"/>
+      <w:lvlText w:val=""/>
+      <w:lvlJc w:val="left"/>
+      <w:pPr>
+        <w:ind w:left="3948" w:hanging="360"/>
+      </w:pPr>
+      <w:rPr>
+        <w:rFonts w:hint="default" w:ascii="Symbol" w:hAnsi="Symbol"/>
+      </w:rPr>
+    </w:lvl>
+    <w:lvl xmlns:w="http://schemas.openxmlformats.org/wordprocessingml/2006/main" w:ilvl="4">
+      <w:start w:val="1"/>
+      <w:numFmt w:val="bullet"/>
+      <w:lvlText w:val="o"/>
+      <w:lvlJc w:val="left"/>
+      <w:pPr>
+        <w:ind w:left="4668" w:hanging="360"/>
+      </w:pPr>
+      <w:rPr>
+        <w:rFonts w:hint="default" w:ascii="Courier New" w:hAnsi="Courier New"/>
+      </w:rPr>
+    </w:lvl>
+    <w:lvl xmlns:w="http://schemas.openxmlformats.org/wordprocessingml/2006/main" w:ilvl="5">
+      <w:start w:val="1"/>
+      <w:numFmt w:val="bullet"/>
+      <w:lvlText w:val=""/>
+      <w:lvlJc w:val="left"/>
+      <w:pPr>
+        <w:ind w:left="5388" w:hanging="360"/>
+      </w:pPr>
+      <w:rPr>
+        <w:rFonts w:hint="default" w:ascii="Wingdings" w:hAnsi="Wingdings"/>
+      </w:rPr>
+    </w:lvl>
+    <w:lvl xmlns:w="http://schemas.openxmlformats.org/wordprocessingml/2006/main" w:ilvl="6">
+      <w:start w:val="1"/>
+      <w:numFmt w:val="bullet"/>
+      <w:lvlText w:val=""/>
+      <w:lvlJc w:val="left"/>
+      <w:pPr>
+        <w:ind w:left="6108" w:hanging="360"/>
+      </w:pPr>
+      <w:rPr>
+        <w:rFonts w:hint="default" w:ascii="Symbol" w:hAnsi="Symbol"/>
+      </w:rPr>
+    </w:lvl>
+    <w:lvl xmlns:w="http://schemas.openxmlformats.org/wordprocessingml/2006/main" w:ilvl="7">
+      <w:start w:val="1"/>
+      <w:numFmt w:val="bullet"/>
+      <w:lvlText w:val="o"/>
+      <w:lvlJc w:val="left"/>
+      <w:pPr>
+        <w:ind w:left="6828" w:hanging="360"/>
+      </w:pPr>
+      <w:rPr>
+        <w:rFonts w:hint="default" w:ascii="Courier New" w:hAnsi="Courier New"/>
+      </w:rPr>
+    </w:lvl>
+    <w:lvl xmlns:w="http://schemas.openxmlformats.org/wordprocessingml/2006/main" w:ilvl="8">
+      <w:start w:val="1"/>
+      <w:numFmt w:val="bullet"/>
+      <w:lvlText w:val=""/>
+      <w:lvlJc w:val="left"/>
+      <w:pPr>
+        <w:ind w:left="7548" w:hanging="360"/>
+      </w:pPr>
+      <w:rPr>
+        <w:rFonts w:hint="default" w:ascii="Wingdings" w:hAnsi="Wingdings"/>
+      </w:rPr>
+    </w:lvl>
+  </w:abstractNum>
   <w:abstractNum w:abstractNumId="0" w15:restartNumberingAfterBreak="0">
     <w:nsid w:val="35F23F7C"/>
     <w:multiLevelType w:val="hybridMultilevel"/>
@@ -3170,6 +4844,9 @@
       </w:pPr>
     </w:lvl>
   </w:abstractNum>
+  <w:num w:numId="3">
+    <w:abstractNumId w:val="2"/>
+  </w:num>
   <w:num w:numId="1">
     <w:abstractNumId w:val="1"/>
   </w:num>
@@ -3180,11 +4857,11 @@
 </file>
 
 <file path=word/styles.xml><?xml version="1.0" encoding="utf-8"?>
-<w:styles xmlns:mc="http://schemas.openxmlformats.org/markup-compatibility/2006" xmlns:r="http://schemas.openxmlformats.org/officeDocument/2006/relationships" xmlns:w="http://schemas.openxmlformats.org/wordprocessingml/2006/main" xmlns:w14="http://schemas.microsoft.com/office/word/2010/wordml" xmlns:w15="http://schemas.microsoft.com/office/word/2012/wordml" xmlns:w16cex="http://schemas.microsoft.com/office/word/2018/wordml/cex" xmlns:w16cid="http://schemas.microsoft.com/office/word/2016/wordml/cid" xmlns:w16="http://schemas.microsoft.com/office/word/2018/wordml" xmlns:w16sdtdh="http://schemas.microsoft.com/office/word/2020/wordml/sdtdatahash" xmlns:w16se="http://schemas.microsoft.com/office/word/2015/wordml/symex" mc:Ignorable="w14 w15 w16se w16cid w16 w16cex w16sdtdh">
+<w:styles xmlns:wp14="http://schemas.microsoft.com/office/word/2010/wordprocessingDrawing" xmlns:mc="http://schemas.openxmlformats.org/markup-compatibility/2006" xmlns:r="http://schemas.openxmlformats.org/officeDocument/2006/relationships" xmlns:w="http://schemas.openxmlformats.org/wordprocessingml/2006/main" xmlns:w14="http://schemas.microsoft.com/office/word/2010/wordml" xmlns:w15="http://schemas.microsoft.com/office/word/2012/wordml" xmlns:w16cex="http://schemas.microsoft.com/office/word/2018/wordml/cex" xmlns:w16cid="http://schemas.microsoft.com/office/word/2016/wordml/cid" xmlns:w16="http://schemas.microsoft.com/office/word/2018/wordml" xmlns:w16sdtdh="http://schemas.microsoft.com/office/word/2020/wordml/sdtdatahash" xmlns:w16se="http://schemas.microsoft.com/office/word/2015/wordml/symex" mc:Ignorable="w14 w15 w16se w16cid w16 w16cex w16sdtdh wp14">
   <w:docDefaults>
     <w:rPrDefault>
       <w:rPr>
-        <w:rFonts w:asciiTheme="minorHAnsi" w:eastAsiaTheme="minorHAnsi" w:hAnsiTheme="minorHAnsi" w:cstheme="minorBidi"/>
+        <w:rFonts w:asciiTheme="minorHAnsi" w:hAnsiTheme="minorHAnsi" w:eastAsiaTheme="minorHAnsi" w:cstheme="minorBidi"/>
         <w:sz w:val="22"/>
         <w:szCs w:val="22"/>
         <w:lang w:val="pt-BR" w:eastAsia="en-US" w:bidi="ar-SA"/>
@@ -3199,14 +4876,14 @@
   <w:latentStyles w:defLockedState="0" w:defUIPriority="99" w:defSemiHidden="0" w:defUnhideWhenUsed="0" w:defQFormat="0" w:count="376">
     <w:lsdException w:name="Normal" w:uiPriority="0" w:qFormat="1"/>
     <w:lsdException w:name="heading 1" w:uiPriority="9" w:qFormat="1"/>
-    <w:lsdException w:name="heading 2" w:semiHidden="1" w:uiPriority="9" w:unhideWhenUsed="1" w:qFormat="1"/>
-    <w:lsdException w:name="heading 3" w:semiHidden="1" w:uiPriority="9" w:unhideWhenUsed="1" w:qFormat="1"/>
-    <w:lsdException w:name="heading 4" w:semiHidden="1" w:uiPriority="9" w:unhideWhenUsed="1" w:qFormat="1"/>
-    <w:lsdException w:name="heading 5" w:semiHidden="1" w:uiPriority="9" w:unhideWhenUsed="1" w:qFormat="1"/>
-    <w:lsdException w:name="heading 6" w:semiHidden="1" w:uiPriority="9" w:unhideWhenUsed="1" w:qFormat="1"/>
-    <w:lsdException w:name="heading 7" w:semiHidden="1" w:uiPriority="9" w:unhideWhenUsed="1" w:qFormat="1"/>
-    <w:lsdException w:name="heading 8" w:semiHidden="1" w:uiPriority="9" w:unhideWhenUsed="1" w:qFormat="1"/>
-    <w:lsdException w:name="heading 9" w:semiHidden="1" w:uiPriority="9" w:unhideWhenUsed="1" w:qFormat="1"/>
+    <w:lsdException w:name="heading 2" w:uiPriority="9" w:semiHidden="1" w:unhideWhenUsed="1" w:qFormat="1"/>
+    <w:lsdException w:name="heading 3" w:uiPriority="9" w:semiHidden="1" w:unhideWhenUsed="1" w:qFormat="1"/>
+    <w:lsdException w:name="heading 4" w:uiPriority="9" w:semiHidden="1" w:unhideWhenUsed="1" w:qFormat="1"/>
+    <w:lsdException w:name="heading 5" w:uiPriority="9" w:semiHidden="1" w:unhideWhenUsed="1" w:qFormat="1"/>
+    <w:lsdException w:name="heading 6" w:uiPriority="9" w:semiHidden="1" w:unhideWhenUsed="1" w:qFormat="1"/>
+    <w:lsdException w:name="heading 7" w:uiPriority="9" w:semiHidden="1" w:unhideWhenUsed="1" w:qFormat="1"/>
+    <w:lsdException w:name="heading 8" w:uiPriority="9" w:semiHidden="1" w:unhideWhenUsed="1" w:qFormat="1"/>
+    <w:lsdException w:name="heading 9" w:uiPriority="9" w:semiHidden="1" w:unhideWhenUsed="1" w:qFormat="1"/>
     <w:lsdException w:name="index 1" w:semiHidden="1" w:unhideWhenUsed="1"/>
     <w:lsdException w:name="index 2" w:semiHidden="1" w:unhideWhenUsed="1"/>
     <w:lsdException w:name="index 3" w:semiHidden="1" w:unhideWhenUsed="1"/>
@@ -3216,22 +4893,22 @@
     <w:lsdException w:name="index 7" w:semiHidden="1" w:unhideWhenUsed="1"/>
     <w:lsdException w:name="index 8" w:semiHidden="1" w:unhideWhenUsed="1"/>
     <w:lsdException w:name="index 9" w:semiHidden="1" w:unhideWhenUsed="1"/>
-    <w:lsdException w:name="toc 1" w:semiHidden="1" w:uiPriority="39" w:unhideWhenUsed="1"/>
-    <w:lsdException w:name="toc 2" w:semiHidden="1" w:uiPriority="39" w:unhideWhenUsed="1"/>
-    <w:lsdException w:name="toc 3" w:semiHidden="1" w:uiPriority="39" w:unhideWhenUsed="1"/>
-    <w:lsdException w:name="toc 4" w:semiHidden="1" w:uiPriority="39" w:unhideWhenUsed="1"/>
-    <w:lsdException w:name="toc 5" w:semiHidden="1" w:uiPriority="39" w:unhideWhenUsed="1"/>
-    <w:lsdException w:name="toc 6" w:semiHidden="1" w:uiPriority="39" w:unhideWhenUsed="1"/>
-    <w:lsdException w:name="toc 7" w:semiHidden="1" w:uiPriority="39" w:unhideWhenUsed="1"/>
-    <w:lsdException w:name="toc 8" w:semiHidden="1" w:uiPriority="39" w:unhideWhenUsed="1"/>
-    <w:lsdException w:name="toc 9" w:semiHidden="1" w:uiPriority="39" w:unhideWhenUsed="1"/>
+    <w:lsdException w:name="toc 1" w:uiPriority="39" w:semiHidden="1" w:unhideWhenUsed="1"/>
+    <w:lsdException w:name="toc 2" w:uiPriority="39" w:semiHidden="1" w:unhideWhenUsed="1"/>
+    <w:lsdException w:name="toc 3" w:uiPriority="39" w:semiHidden="1" w:unhideWhenUsed="1"/>
+    <w:lsdException w:name="toc 4" w:uiPriority="39" w:semiHidden="1" w:unhideWhenUsed="1"/>
+    <w:lsdException w:name="toc 5" w:uiPriority="39" w:semiHidden="1" w:unhideWhenUsed="1"/>
+    <w:lsdException w:name="toc 6" w:uiPriority="39" w:semiHidden="1" w:unhideWhenUsed="1"/>
+    <w:lsdException w:name="toc 7" w:uiPriority="39" w:semiHidden="1" w:unhideWhenUsed="1"/>
+    <w:lsdException w:name="toc 8" w:uiPriority="39" w:semiHidden="1" w:unhideWhenUsed="1"/>
+    <w:lsdException w:name="toc 9" w:uiPriority="39" w:semiHidden="1" w:unhideWhenUsed="1"/>
     <w:lsdException w:name="Normal Indent" w:semiHidden="1" w:unhideWhenUsed="1"/>
     <w:lsdException w:name="footnote text" w:semiHidden="1" w:unhideWhenUsed="1"/>
     <w:lsdException w:name="annotation text" w:semiHidden="1" w:unhideWhenUsed="1"/>
     <w:lsdException w:name="header" w:semiHidden="1" w:unhideWhenUsed="1"/>
     <w:lsdException w:name="footer" w:semiHidden="1" w:unhideWhenUsed="1"/>
     <w:lsdException w:name="index heading" w:semiHidden="1" w:unhideWhenUsed="1"/>
-    <w:lsdException w:name="caption" w:semiHidden="1" w:uiPriority="35" w:unhideWhenUsed="1" w:qFormat="1"/>
+    <w:lsdException w:name="caption" w:uiPriority="35" w:semiHidden="1" w:unhideWhenUsed="1" w:qFormat="1"/>
     <w:lsdException w:name="table of figures" w:semiHidden="1" w:unhideWhenUsed="1"/>
     <w:lsdException w:name="envelope address" w:semiHidden="1" w:unhideWhenUsed="1"/>
     <w:lsdException w:name="envelope return" w:semiHidden="1" w:unhideWhenUsed="1"/>
@@ -3262,7 +4939,7 @@
     <w:lsdException w:name="Title" w:uiPriority="10" w:qFormat="1"/>
     <w:lsdException w:name="Closing" w:semiHidden="1" w:unhideWhenUsed="1"/>
     <w:lsdException w:name="Signature" w:semiHidden="1" w:unhideWhenUsed="1"/>
-    <w:lsdException w:name="Default Paragraph Font" w:semiHidden="1" w:uiPriority="1" w:unhideWhenUsed="1"/>
+    <w:lsdException w:name="Default Paragraph Font" w:uiPriority="1" w:semiHidden="1" w:unhideWhenUsed="1"/>
     <w:lsdException w:name="Body Text" w:semiHidden="1" w:unhideWhenUsed="1"/>
     <w:lsdException w:name="Body Text Indent" w:semiHidden="1" w:unhideWhenUsed="1"/>
     <w:lsdException w:name="List Continue" w:semiHidden="1" w:unhideWhenUsed="1"/>
@@ -3462,8 +5139,8 @@
     <w:lsdException w:name="Subtle Reference" w:uiPriority="31" w:qFormat="1"/>
     <w:lsdException w:name="Intense Reference" w:uiPriority="32" w:qFormat="1"/>
     <w:lsdException w:name="Book Title" w:uiPriority="33" w:qFormat="1"/>
-    <w:lsdException w:name="Bibliography" w:semiHidden="1" w:uiPriority="37" w:unhideWhenUsed="1"/>
-    <w:lsdException w:name="TOC Heading" w:semiHidden="1" w:uiPriority="39" w:unhideWhenUsed="1" w:qFormat="1"/>
+    <w:lsdException w:name="Bibliography" w:uiPriority="37" w:semiHidden="1" w:unhideWhenUsed="1"/>
+    <w:lsdException w:name="TOC Heading" w:uiPriority="39" w:semiHidden="1" w:unhideWhenUsed="1" w:qFormat="1"/>
     <w:lsdException w:name="Plain Table 1" w:uiPriority="41"/>
     <w:lsdException w:name="Plain Table 2" w:uiPriority="42"/>
     <w:lsdException w:name="Plain Table 3" w:uiPriority="43"/>
@@ -3574,16 +5251,16 @@
     <w:lsdException w:name="Unresolved Mention" w:semiHidden="1" w:unhideWhenUsed="1"/>
     <w:lsdException w:name="Smart Link" w:semiHidden="1" w:unhideWhenUsed="1"/>
   </w:latentStyles>
-  <w:style w:type="paragraph" w:default="1" w:styleId="Normal">
+  <w:style w:type="paragraph" w:styleId="Normal" w:default="1">
     <w:name w:val="Normal"/>
     <w:qFormat/>
   </w:style>
-  <w:style w:type="character" w:default="1" w:styleId="Fontepargpadro">
+  <w:style w:type="character" w:styleId="Fontepargpadro" w:default="1">
     <w:name w:val="Default Paragraph Font"/>
     <w:uiPriority w:val="1"/>
     <w:unhideWhenUsed/>
   </w:style>
-  <w:style w:type="table" w:default="1" w:styleId="Tabelanormal">
+  <w:style w:type="table" w:styleId="Tabelanormal" w:default="1">
     <w:name w:val="Normal Table"/>
     <w:uiPriority w:val="99"/>
     <w:semiHidden/>
@@ -3598,7 +5275,7 @@
       </w:tblCellMar>
     </w:tblPr>
   </w:style>
-  <w:style w:type="numbering" w:default="1" w:styleId="Semlista">
+  <w:style w:type="numbering" w:styleId="Semlista" w:default="1">
     <w:name w:val="No List"/>
     <w:uiPriority w:val="99"/>
     <w:semiHidden/>
@@ -3625,7 +5302,7 @@
       <w:spacing w:before="100" w:beforeAutospacing="1" w:after="100" w:afterAutospacing="1" w:line="240" w:lineRule="auto"/>
     </w:pPr>
     <w:rPr>
-      <w:rFonts w:ascii="Times New Roman" w:eastAsia="Times New Roman" w:hAnsi="Times New Roman" w:cs="Times New Roman"/>
+      <w:rFonts w:ascii="Times New Roman" w:hAnsi="Times New Roman" w:eastAsia="Times New Roman" w:cs="Times New Roman"/>
       <w:sz w:val="24"/>
       <w:szCs w:val="24"/>
       <w:lang w:eastAsia="pt-BR"/>
@@ -3635,7 +5312,7 @@
 </file>
 
 <file path=word/theme/theme1.xml><?xml version="1.0" encoding="utf-8"?>
-<a:theme xmlns:a="http://schemas.openxmlformats.org/drawingml/2006/main" name="Tema do Office">
+<a:theme xmlns:a="http://schemas.openxmlformats.org/drawingml/2006/main" xmlns:thm15="http://schemas.microsoft.com/office/thememl/2012/main" name="Tema do Office">
   <a:themeElements>
     <a:clrScheme name="Office">
       <a:dk1>

</xml_diff>